<commit_message>
UpdateDocWordRuns&PlanD2+D3   - Revert D2-Safety   - reward -= 50.0 ripristinato.   - safe_to_push = hazard_risk < 0.75 ripristinato.   - rimossi hazard_margin, speed/throttle penalty safety, brake bonus safety.   - D1 resta assente.   - D2 resta attiva: target_min_speed = 8.0, start/unblock shaping, no_wp_steps > 100.
</commit_message>
<xml_diff>
--- a/reports/carla_finetuning_maggio_2026.docx
+++ b/reports/carla_finetuning_maggio_2026.docx
@@ -13,7 +13,7 @@
     </w:p>
     <w:p>
       <w:r>
-        <w:t xml:space="preserve">Aggiornamento: 14/05/2026.</w:t>
+        <w:t xml:space="preserve">Aggiornamento: 14/05/2026 dopo valutazione run carla_mappo_20260514_155151.</w:t>
       </w:r>
     </w:p>
     <w:p>
@@ -47,7 +47,7 @@
     </w:p>
     <w:p>
       <w:r>
-        <w:t xml:space="preserve">La baseline di riferimento resta carla_mappo_20260511_153859. Il problema primario osservato e misurato resta il basso progresso iniziale dei veicoli e l alto stuck/timeout vehicle-level.</w:t>
+        <w:t xml:space="preserve">La baseline di riferimento resta carla_mappo_20260511_153859. Il problema primario resta basso progresso iniziale dei veicoli e alto stuck/timeout vehicle-level.</w:t>
       </w:r>
     </w:p>
     <w:p>
@@ -62,7 +62,7 @@
     </w:p>
     <w:p>
       <w:r>
-        <w:t xml:space="preserve">C2v2-A ha aumentato shaping di movimento e waypoint, ma non ha superato il gate completo per via di stuck+timeout ancora alto.</w:t>
+        <w:t xml:space="preserve">C2v2-A e D2 hanno esplorato reward di movimento. D2 e la variante piu informativa: aumenta movimento e riduce stuck+timeout, ma peggiora collision/offroad.</w:t>
       </w:r>
     </w:p>
     <w:p>
@@ -733,6 +733,108 @@
           </w:p>
         </w:tc>
       </w:tr>
+      <w:tr>
+        <w:tc>
+          <w:tcPr>
+            <w:tcW w:w="2400" w:type="dxa"/>
+          </w:tcPr>
+          <w:p>
+            <w:r>
+              <w:t xml:space="preserve">D2-Safety 20260514_155151</w:t>
+            </w:r>
+          </w:p>
+        </w:tc>
+        <w:tc>
+          <w:tcPr>
+            <w:tcW w:w="2400" w:type="dxa"/>
+          </w:tcPr>
+          <w:p>
+            <w:r>
+              <w:t xml:space="preserve">963</w:t>
+            </w:r>
+          </w:p>
+        </w:tc>
+        <w:tc>
+          <w:tcPr>
+            <w:tcW w:w="2400" w:type="dxa"/>
+          </w:tcPr>
+          <w:p>
+            <w:r>
+              <w:t xml:space="preserve">18.38%</w:t>
+            </w:r>
+          </w:p>
+        </w:tc>
+        <w:tc>
+          <w:tcPr>
+            <w:tcW w:w="2400" w:type="dxa"/>
+          </w:tcPr>
+          <w:p>
+            <w:r>
+              <w:t xml:space="preserve">53.17%</w:t>
+            </w:r>
+          </w:p>
+        </w:tc>
+        <w:tc>
+          <w:tcPr>
+            <w:tcW w:w="2400" w:type="dxa"/>
+          </w:tcPr>
+          <w:p>
+            <w:r>
+              <w:t xml:space="preserve">20.15%</w:t>
+            </w:r>
+          </w:p>
+        </w:tc>
+        <w:tc>
+          <w:tcPr>
+            <w:tcW w:w="2400" w:type="dxa"/>
+          </w:tcPr>
+          <w:p>
+            <w:r>
+              <w:t xml:space="preserve">8.31%</w:t>
+            </w:r>
+          </w:p>
+        </w:tc>
+        <w:tc>
+          <w:tcPr>
+            <w:tcW w:w="2400" w:type="dxa"/>
+          </w:tcPr>
+          <w:p>
+            <w:r>
+              <w:t xml:space="preserve">0.4758</w:t>
+            </w:r>
+          </w:p>
+        </w:tc>
+        <w:tc>
+          <w:tcPr>
+            <w:tcW w:w="2400" w:type="dxa"/>
+          </w:tcPr>
+          <w:p>
+            <w:r>
+              <w:t xml:space="preserve">0.6722</w:t>
+            </w:r>
+          </w:p>
+        </w:tc>
+        <w:tc>
+          <w:tcPr>
+            <w:tcW w:w="2400" w:type="dxa"/>
+          </w:tcPr>
+          <w:p>
+            <w:r>
+              <w:t xml:space="preserve">11.90</w:t>
+            </w:r>
+          </w:p>
+        </w:tc>
+        <w:tc>
+          <w:tcPr>
+            <w:tcW w:w="2400" w:type="dxa"/>
+          </w:tcPr>
+          <w:p>
+            <w:r>
+              <w:t xml:space="preserve">scartata: safety non corretta e SR giu</w:t>
+            </w:r>
+          </w:p>
+        </w:tc>
+      </w:tr>
     </w:tbl>
     <w:p>
       <w:r>
@@ -826,6 +928,19 @@
             </w:r>
           </w:p>
         </w:tc>
+        <w:tc>
+          <w:tcPr>
+            <w:tcW w:w="2400" w:type="dxa"/>
+          </w:tcPr>
+          <w:p>
+            <w:r>
+              <w:rPr>
+                <w:b/>
+              </w:rPr>
+              <w:t xml:space="preserve">NaN/inf</w:t>
+            </w:r>
+          </w:p>
+        </w:tc>
       </w:tr>
       <w:tr>
         <w:tc>
@@ -878,6 +993,16 @@
             </w:r>
           </w:p>
         </w:tc>
+        <w:tc>
+          <w:tcPr>
+            <w:tcW w:w="2400" w:type="dxa"/>
+          </w:tcPr>
+          <w:p>
+            <w:r>
+              <w:t xml:space="preserve">n/d pre-C0</w:t>
+            </w:r>
+          </w:p>
+        </w:tc>
       </w:tr>
       <w:tr>
         <w:tc>
@@ -930,6 +1055,16 @@
             </w:r>
           </w:p>
         </w:tc>
+        <w:tc>
+          <w:tcPr>
+            <w:tcW w:w="2400" w:type="dxa"/>
+          </w:tcPr>
+          <w:p>
+            <w:r>
+              <w:t xml:space="preserve">0</w:t>
+            </w:r>
+          </w:p>
+        </w:tc>
       </w:tr>
       <w:tr>
         <w:tc>
@@ -982,6 +1117,16 @@
             </w:r>
           </w:p>
         </w:tc>
+        <w:tc>
+          <w:tcPr>
+            <w:tcW w:w="2400" w:type="dxa"/>
+          </w:tcPr>
+          <w:p>
+            <w:r>
+              <w:t xml:space="preserve">0</w:t>
+            </w:r>
+          </w:p>
+        </w:tc>
       </w:tr>
       <w:tr>
         <w:tc>
@@ -1034,6 +1179,16 @@
             </w:r>
           </w:p>
         </w:tc>
+        <w:tc>
+          <w:tcPr>
+            <w:tcW w:w="2400" w:type="dxa"/>
+          </w:tcPr>
+          <w:p>
+            <w:r>
+              <w:t xml:space="preserve">0</w:t>
+            </w:r>
+          </w:p>
+        </w:tc>
       </w:tr>
       <w:tr>
         <w:tc>
@@ -1063,6 +1218,78 @@
           <w:p>
             <w:r>
               <w:t xml:space="preserve">313</w:t>
+            </w:r>
+          </w:p>
+        </w:tc>
+        <w:tc>
+          <w:tcPr>
+            <w:tcW w:w="2400" w:type="dxa"/>
+          </w:tcPr>
+          <w:p>
+            <w:r>
+              <w:t xml:space="preserve">0</w:t>
+            </w:r>
+          </w:p>
+        </w:tc>
+        <w:tc>
+          <w:tcPr>
+            <w:tcW w:w="2400" w:type="dxa"/>
+          </w:tcPr>
+          <w:p>
+            <w:r>
+              <w:t xml:space="preserve">0</w:t>
+            </w:r>
+          </w:p>
+        </w:tc>
+        <w:tc>
+          <w:tcPr>
+            <w:tcW w:w="2400" w:type="dxa"/>
+          </w:tcPr>
+          <w:p>
+            <w:r>
+              <w:t xml:space="preserve">0</w:t>
+            </w:r>
+          </w:p>
+        </w:tc>
+      </w:tr>
+      <w:tr>
+        <w:tc>
+          <w:tcPr>
+            <w:tcW w:w="2400" w:type="dxa"/>
+          </w:tcPr>
+          <w:p>
+            <w:r>
+              <w:t xml:space="preserve">D2-Safety 20260514_155151</w:t>
+            </w:r>
+          </w:p>
+        </w:tc>
+        <w:tc>
+          <w:tcPr>
+            <w:tcW w:w="2400" w:type="dxa"/>
+          </w:tcPr>
+          <w:p>
+            <w:r>
+              <w:t xml:space="preserve">1926</w:t>
+            </w:r>
+          </w:p>
+        </w:tc>
+        <w:tc>
+          <w:tcPr>
+            <w:tcW w:w="2400" w:type="dxa"/>
+          </w:tcPr>
+          <w:p>
+            <w:r>
+              <w:t xml:space="preserve">321</w:t>
+            </w:r>
+          </w:p>
+        </w:tc>
+        <w:tc>
+          <w:tcPr>
+            <w:tcW w:w="2400" w:type="dxa"/>
+          </w:tcPr>
+          <w:p>
+            <w:r>
+              <w:t xml:space="preserve">0</w:t>
             </w:r>
           </w:p>
         </w:tc>
@@ -1099,85 +1326,7 @@
           <w:b/>
           <w:sz w:val="26"/>
         </w:rPr>
-        <w:t xml:space="preserve">Considerazioni aggiornate sulle run</w:t>
-      </w:r>
-    </w:p>
-    <w:p>
-      <w:r>
-        <w:t xml:space="preserve">C2v2-A migliora SR vehicle rispetto alla baseline e migliora collision/offroad, ma peggiora stuck+timeout. Non va promossa come trunk finale.</w:t>
-      </w:r>
-    </w:p>
-    <w:p>
-      <w:r>
-        <w:t xml:space="preserve">D1 da sola non e valida: SR scende e stuck+timeout peggiora. In combinazione D1+D2 peggiora ulteriormente SR, stuck+timeout, velocita media e path efficiency. D1 e quindi da considerare fallita e rimossa dallo stato candidato.</w:t>
-      </w:r>
-    </w:p>
-    <w:p>
-      <w:r>
-        <w:t xml:space="preserve">D2 ha un segnale utile e misurato: aumenta la velocita media vehicle a 13.50 km/h, riduce stuck+timeout a 53.38% e migliora path efficiency a 0.6327. Il failure mode e pero chiaro: collision sale a 19.30% e offroad a 6.65%.</w:t>
-      </w:r>
-    </w:p>
-    <w:p>
-      <w:r>
-        <w:t xml:space="preserve">La decisione corrente e mantenere D2 come base esplorativa, revertire D1 e applicare D2-Safety prima di passare a D3. Questo isola il problema osservato: D2 spinge i veicoli a muoversi, ma serve correggere il rischio safety.</w:t>
-      </w:r>
-    </w:p>
-    <w:p>
-      <w:r>
-        <w:t xml:space="preserve"/>
-      </w:r>
-    </w:p>
-    <w:p>
-      <w:r>
-        <w:rPr>
-          <w:b/>
-          <w:sz w:val="26"/>
-        </w:rPr>
-        <w:t xml:space="preserve">D2-Safety implementata</w:t>
-      </w:r>
-    </w:p>
-    <w:p>
-      <w:r>
-        <w:t xml:space="preserve">Stato: implementata nel working tree, non ancora valutata con run.</w:t>
-      </w:r>
-    </w:p>
-    <w:p>
-      <w:r>
-        <w:t xml:space="preserve">File modificato: carla_core/envs/carla_multi_agent_env.py, funzione _vehicle_reward.</w:t>
-      </w:r>
-    </w:p>
-    <w:p>
-      <w:r>
-        <w:t xml:space="preserve">D1 risulta rimossa dall osservazione vehicle: obs[2] torna vel.z / 30 e obs[5] torna acc.z / 10.</w:t>
-      </w:r>
-    </w:p>
-    <w:p>
-      <w:r>
-        <w:t xml:space="preserve">D2 resta attiva: start/unblock shaping, target_min_speed 8 km/h e no_wp_steps penalty &gt; 100.</w:t>
-      </w:r>
-    </w:p>
-    <w:p>
-      <w:r>
-        <w:t xml:space="preserve">D2-Safety aggiunge collision penalty scalata con velocita, abbassa safe_to_push da hazard_risk &lt; 0.75 a &lt; 0.55, penalizza speed/throttle in presenza di hazard e premia brake solo se il veicolo e gia in movimento.</w:t>
-      </w:r>
-    </w:p>
-    <w:p>
-      <w:r>
-        <w:t xml:space="preserve">Rischio sperimentale: puo ridurre collisioni ma togliere troppa spinta, facendo risalire stuck/timeout. Per questo e una ablation da testare, non un trunk accettato.</w:t>
-      </w:r>
-    </w:p>
-    <w:p>
-      <w:r>
-        <w:t xml:space="preserve"/>
-      </w:r>
-    </w:p>
-    <w:p>
-      <w:r>
-        <w:rPr>
-          <w:b/>
-          <w:sz w:val="26"/>
-        </w:rPr>
-        <w:t xml:space="preserve">Gate decisionale D2-Safety</w:t>
+        <w:t xml:space="preserve">Confronto D2-Safety</w:t>
       </w:r>
     </w:p>
     <w:tbl>
@@ -1202,44 +1351,19 @@
               <w:rPr>
                 <w:b/>
               </w:rPr>
-              <w:t xml:space="preserve">Metrica vehicle</w:t>
-            </w:r>
-          </w:p>
-        </w:tc>
-        <w:tc>
-          <w:tcPr>
-            <w:tcW w:w="2400" w:type="dxa"/>
-          </w:tcPr>
-          <w:p>
-            <w:r>
-              <w:rPr>
-                <w:b/>
-              </w:rPr>
-              <w:t xml:space="preserve">Baseline</w:t>
-            </w:r>
-          </w:p>
-        </w:tc>
-        <w:tc>
-          <w:tcPr>
-            <w:tcW w:w="2400" w:type="dxa"/>
-          </w:tcPr>
-          <w:p>
-            <w:r>
-              <w:rPr>
-                <w:b/>
-              </w:rPr>
-              <w:t xml:space="preserve">Gate D2-Safety</w:t>
-            </w:r>
-          </w:p>
-        </w:tc>
-      </w:tr>
-      <w:tr>
-        <w:tc>
-          <w:tcPr>
-            <w:tcW w:w="2400" w:type="dxa"/>
-          </w:tcPr>
-          <w:p>
-            <w:r>
+              <w:t xml:space="preserve">Confronto vehicle</w:t>
+            </w:r>
+          </w:p>
+        </w:tc>
+        <w:tc>
+          <w:tcPr>
+            <w:tcW w:w="2400" w:type="dxa"/>
+          </w:tcPr>
+          <w:p>
+            <w:r>
+              <w:rPr>
+                <w:b/>
+              </w:rPr>
               <w:t xml:space="preserve">SR</w:t>
             </w:r>
           </w:p>
@@ -1250,28 +1374,9 @@
           </w:tcPr>
           <w:p>
             <w:r>
-              <w:t xml:space="preserve">20.53%</w:t>
-            </w:r>
-          </w:p>
-        </w:tc>
-        <w:tc>
-          <w:tcPr>
-            <w:tcW w:w="2400" w:type="dxa"/>
-          </w:tcPr>
-          <w:p>
-            <w:r>
-              <w:t xml:space="preserve">&gt;= 22.53% per promozione piena; non deve scendere sotto baseline per tenere ablation</w:t>
-            </w:r>
-          </w:p>
-        </w:tc>
-      </w:tr>
-      <w:tr>
-        <w:tc>
-          <w:tcPr>
-            <w:tcW w:w="2400" w:type="dxa"/>
-          </w:tcPr>
-          <w:p>
-            <w:r>
+              <w:rPr>
+                <w:b/>
+              </w:rPr>
               <w:t xml:space="preserve">Stuck+Timeout</w:t>
             </w:r>
           </w:p>
@@ -1282,28 +1387,9 @@
           </w:tcPr>
           <w:p>
             <w:r>
-              <w:t xml:space="preserve">57.14%</w:t>
-            </w:r>
-          </w:p>
-        </w:tc>
-        <w:tc>
-          <w:tcPr>
-            <w:tcW w:w="2400" w:type="dxa"/>
-          </w:tcPr>
-          <w:p>
-            <w:r>
-              <w:t xml:space="preserve">&lt;= 55.14% per gate pieno; deve restare sotto baseline</w:t>
-            </w:r>
-          </w:p>
-        </w:tc>
-      </w:tr>
-      <w:tr>
-        <w:tc>
-          <w:tcPr>
-            <w:tcW w:w="2400" w:type="dxa"/>
-          </w:tcPr>
-          <w:p>
-            <w:r>
+              <w:rPr>
+                <w:b/>
+              </w:rPr>
               <w:t xml:space="preserve">Collision</w:t>
             </w:r>
           </w:p>
@@ -1314,28 +1400,9 @@
           </w:tcPr>
           <w:p>
             <w:r>
-              <w:t xml:space="preserve">16.40%</w:t>
-            </w:r>
-          </w:p>
-        </w:tc>
-        <w:tc>
-          <w:tcPr>
-            <w:tcW w:w="2400" w:type="dxa"/>
-          </w:tcPr>
-          <w:p>
-            <w:r>
-              <w:t xml:space="preserve">&lt;= 17.40%; deve correggere il 19.30% osservato in D2</w:t>
-            </w:r>
-          </w:p>
-        </w:tc>
-      </w:tr>
-      <w:tr>
-        <w:tc>
-          <w:tcPr>
-            <w:tcW w:w="2400" w:type="dxa"/>
-          </w:tcPr>
-          <w:p>
-            <w:r>
+              <w:rPr>
+                <w:b/>
+              </w:rPr>
               <w:t xml:space="preserve">Offroad</w:t>
             </w:r>
           </w:p>
@@ -1346,17 +1413,282 @@
           </w:tcPr>
           <w:p>
             <w:r>
-              <w:t xml:space="preserve">5.93%</w:t>
-            </w:r>
-          </w:p>
-        </w:tc>
-        <w:tc>
-          <w:tcPr>
-            <w:tcW w:w="2400" w:type="dxa"/>
-          </w:tcPr>
-          <w:p>
-            <w:r>
-              <w:t xml:space="preserve">&lt;= 6.93%</w:t>
+              <w:rPr>
+                <w:b/>
+              </w:rPr>
+              <w:t xml:space="preserve">Route</w:t>
+            </w:r>
+          </w:p>
+        </w:tc>
+        <w:tc>
+          <w:tcPr>
+            <w:tcW w:w="2400" w:type="dxa"/>
+          </w:tcPr>
+          <w:p>
+            <w:r>
+              <w:rPr>
+                <w:b/>
+              </w:rPr>
+              <w:t xml:space="preserve">Path eff.</w:t>
+            </w:r>
+          </w:p>
+        </w:tc>
+        <w:tc>
+          <w:tcPr>
+            <w:tcW w:w="2400" w:type="dxa"/>
+          </w:tcPr>
+          <w:p>
+            <w:r>
+              <w:rPr>
+                <w:b/>
+              </w:rPr>
+              <w:t xml:space="preserve">Speed</w:t>
+            </w:r>
+          </w:p>
+        </w:tc>
+      </w:tr>
+      <w:tr>
+        <w:tc>
+          <w:tcPr>
+            <w:tcW w:w="2400" w:type="dxa"/>
+          </w:tcPr>
+          <w:p>
+            <w:r>
+              <w:t xml:space="preserve">D2-Safety vs baseline</w:t>
+            </w:r>
+          </w:p>
+        </w:tc>
+        <w:tc>
+          <w:tcPr>
+            <w:tcW w:w="2400" w:type="dxa"/>
+          </w:tcPr>
+          <w:p>
+            <w:r>
+              <w:t xml:space="preserve">-2.15 pp</w:t>
+            </w:r>
+          </w:p>
+        </w:tc>
+        <w:tc>
+          <w:tcPr>
+            <w:tcW w:w="2400" w:type="dxa"/>
+          </w:tcPr>
+          <w:p>
+            <w:r>
+              <w:t xml:space="preserve">-3.98 pp</w:t>
+            </w:r>
+          </w:p>
+        </w:tc>
+        <w:tc>
+          <w:tcPr>
+            <w:tcW w:w="2400" w:type="dxa"/>
+          </w:tcPr>
+          <w:p>
+            <w:r>
+              <w:t xml:space="preserve">+3.74 pp</w:t>
+            </w:r>
+          </w:p>
+        </w:tc>
+        <w:tc>
+          <w:tcPr>
+            <w:tcW w:w="2400" w:type="dxa"/>
+          </w:tcPr>
+          <w:p>
+            <w:r>
+              <w:t xml:space="preserve">+2.38 pp</w:t>
+            </w:r>
+          </w:p>
+        </w:tc>
+        <w:tc>
+          <w:tcPr>
+            <w:tcW w:w="2400" w:type="dxa"/>
+          </w:tcPr>
+          <w:p>
+            <w:r>
+              <w:t xml:space="preserve">+0.0493</w:t>
+            </w:r>
+          </w:p>
+        </w:tc>
+        <w:tc>
+          <w:tcPr>
+            <w:tcW w:w="2400" w:type="dxa"/>
+          </w:tcPr>
+          <w:p>
+            <w:r>
+              <w:t xml:space="preserve">+0.0766</w:t>
+            </w:r>
+          </w:p>
+        </w:tc>
+        <w:tc>
+          <w:tcPr>
+            <w:tcW w:w="2400" w:type="dxa"/>
+          </w:tcPr>
+          <w:p>
+            <w:r>
+              <w:t xml:space="preserve">n/d</w:t>
+            </w:r>
+          </w:p>
+        </w:tc>
+      </w:tr>
+      <w:tr>
+        <w:tc>
+          <w:tcPr>
+            <w:tcW w:w="2400" w:type="dxa"/>
+          </w:tcPr>
+          <w:p>
+            <w:r>
+              <w:t xml:space="preserve">D2-Safety vs D2</w:t>
+            </w:r>
+          </w:p>
+        </w:tc>
+        <w:tc>
+          <w:tcPr>
+            <w:tcW w:w="2400" w:type="dxa"/>
+          </w:tcPr>
+          <w:p>
+            <w:r>
+              <w:t xml:space="preserve">-2.30 pp</w:t>
+            </w:r>
+          </w:p>
+        </w:tc>
+        <w:tc>
+          <w:tcPr>
+            <w:tcW w:w="2400" w:type="dxa"/>
+          </w:tcPr>
+          <w:p>
+            <w:r>
+              <w:t xml:space="preserve">-0.21 pp</w:t>
+            </w:r>
+          </w:p>
+        </w:tc>
+        <w:tc>
+          <w:tcPr>
+            <w:tcW w:w="2400" w:type="dxa"/>
+          </w:tcPr>
+          <w:p>
+            <w:r>
+              <w:t xml:space="preserve">+0.84 pp</w:t>
+            </w:r>
+          </w:p>
+        </w:tc>
+        <w:tc>
+          <w:tcPr>
+            <w:tcW w:w="2400" w:type="dxa"/>
+          </w:tcPr>
+          <w:p>
+            <w:r>
+              <w:t xml:space="preserve">+1.66 pp</w:t>
+            </w:r>
+          </w:p>
+        </w:tc>
+        <w:tc>
+          <w:tcPr>
+            <w:tcW w:w="2400" w:type="dxa"/>
+          </w:tcPr>
+          <w:p>
+            <w:r>
+              <w:t xml:space="preserve">+0.0247</w:t>
+            </w:r>
+          </w:p>
+        </w:tc>
+        <w:tc>
+          <w:tcPr>
+            <w:tcW w:w="2400" w:type="dxa"/>
+          </w:tcPr>
+          <w:p>
+            <w:r>
+              <w:t xml:space="preserve">+0.0394</w:t>
+            </w:r>
+          </w:p>
+        </w:tc>
+        <w:tc>
+          <w:tcPr>
+            <w:tcW w:w="2400" w:type="dxa"/>
+          </w:tcPr>
+          <w:p>
+            <w:r>
+              <w:t xml:space="preserve">-1.60</w:t>
+            </w:r>
+          </w:p>
+        </w:tc>
+      </w:tr>
+      <w:tr>
+        <w:tc>
+          <w:tcPr>
+            <w:tcW w:w="2400" w:type="dxa"/>
+          </w:tcPr>
+          <w:p>
+            <w:r>
+              <w:t xml:space="preserve">D2-Safety vs D1+D2</w:t>
+            </w:r>
+          </w:p>
+        </w:tc>
+        <w:tc>
+          <w:tcPr>
+            <w:tcW w:w="2400" w:type="dxa"/>
+          </w:tcPr>
+          <w:p>
+            <w:r>
+              <w:t xml:space="preserve">+1.34 pp</w:t>
+            </w:r>
+          </w:p>
+        </w:tc>
+        <w:tc>
+          <w:tcPr>
+            <w:tcW w:w="2400" w:type="dxa"/>
+          </w:tcPr>
+          <w:p>
+            <w:r>
+              <w:t xml:space="preserve">-11.37 pp</w:t>
+            </w:r>
+          </w:p>
+        </w:tc>
+        <w:tc>
+          <w:tcPr>
+            <w:tcW w:w="2400" w:type="dxa"/>
+          </w:tcPr>
+          <w:p>
+            <w:r>
+              <w:t xml:space="preserve">+6.51 pp</w:t>
+            </w:r>
+          </w:p>
+        </w:tc>
+        <w:tc>
+          <w:tcPr>
+            <w:tcW w:w="2400" w:type="dxa"/>
+          </w:tcPr>
+          <w:p>
+            <w:r>
+              <w:t xml:space="preserve">+3.52 pp</w:t>
+            </w:r>
+          </w:p>
+        </w:tc>
+        <w:tc>
+          <w:tcPr>
+            <w:tcW w:w="2400" w:type="dxa"/>
+          </w:tcPr>
+          <w:p>
+            <w:r>
+              <w:t xml:space="preserve">+0.0646</w:t>
+            </w:r>
+          </w:p>
+        </w:tc>
+        <w:tc>
+          <w:tcPr>
+            <w:tcW w:w="2400" w:type="dxa"/>
+          </w:tcPr>
+          <w:p>
+            <w:r>
+              <w:t xml:space="preserve">+0.1198</w:t>
+            </w:r>
+          </w:p>
+        </w:tc>
+        <w:tc>
+          <w:tcPr>
+            <w:tcW w:w="2400" w:type="dxa"/>
+          </w:tcPr>
+          <w:p>
+            <w:r>
+              <w:t xml:space="preserve">+2.24</w:t>
             </w:r>
           </w:p>
         </w:tc>
@@ -1373,32 +1705,22 @@
           <w:b/>
           <w:sz w:val="26"/>
         </w:rPr>
-        <w:t xml:space="preserve">Prossimi step</w:t>
-      </w:r>
-    </w:p>
-    <w:p>
-      <w:r>
-        <w:t xml:space="preserve">1. Eseguire run esplorativa 300K locked easy, seed 999, con stato corrente D2 + D2-Safety e D1 rimossa.</w:t>
-      </w:r>
-    </w:p>
-    <w:p>
-      <w:r>
-        <w:t xml:space="preserve">2. Ricalcolare metriche da episodes.jsonl a fine run, deduplicando episode_id + agent_id e verificando 6 record agent-level per episodio.</w:t>
-      </w:r>
-    </w:p>
-    <w:p>
-      <w:r>
-        <w:t xml:space="preserve">3. Se D2-Safety corregge collision/offroad mantenendo stuck+timeout sotto baseline, puo diventare candidato da confrontare con D3.</w:t>
-      </w:r>
-    </w:p>
-    <w:p>
-      <w:r>
-        <w:t xml:space="preserve">4. Se D2-Safety riduce troppo il movimento o non corregge safety, revert D2-Safety e procedere con D3 isolata sopra la base scelta.</w:t>
-      </w:r>
-    </w:p>
-    <w:p>
-      <w:r>
-        <w:t xml:space="preserve">5. D3 resta successivo: non anticiparlo finche non e chiaro se la safety correction su D2 risolve il failure mode gia misurato.</w:t>
+        <w:t xml:space="preserve">Decisione su D2-Safety</w:t>
+      </w:r>
+    </w:p>
+    <w:p>
+      <w:r>
+        <w:t xml:space="preserve">D2-Safety non passa il gate. Rispetto alla baseline abbassa stuck+timeout da 57.14% a 53.17%, ma peggiora SR da 20.53% a 18.38%, collision da 16.40% a 20.15% e offroad da 5.93% a 8.31%.</w:t>
+      </w:r>
+    </w:p>
+    <w:p>
+      <w:r>
+        <w:t xml:space="preserve">Rispetto a D2 non corregge il failure mode safety: collision resta alta e offroad peggiora. Inoltre riduce la velocita media vehicle da 13.50 a 11.90 km/h.</w:t>
+      </w:r>
+    </w:p>
+    <w:p>
+      <w:r>
+        <w:t xml:space="preserve">Decisione: D2-Safety scartata e revertita. Lo stato codice torna a D2-only come base esplorativa.</w:t>
       </w:r>
     </w:p>
     <w:p>
@@ -1412,7 +1734,502 @@
           <w:b/>
           <w:sz w:val="26"/>
         </w:rPr>
-        <w:t xml:space="preserve">Comando run proposto</w:t>
+        <w:t xml:space="preserve">Stato corrente e punti aperti</w:t>
+      </w:r>
+    </w:p>
+    <w:tbl>
+      <w:tblPr>
+        <w:tblW w:w="0" w:type="auto"/>
+        <w:tblBorders>
+          <w:top w:val="single" w:sz="4" w:space="0" w:color="auto"/>
+          <w:left w:val="single" w:sz="4" w:space="0" w:color="auto"/>
+          <w:bottom w:val="single" w:sz="4" w:space="0" w:color="auto"/>
+          <w:right w:val="single" w:sz="4" w:space="0" w:color="auto"/>
+          <w:insideH w:val="single" w:sz="4" w:space="0" w:color="auto"/>
+          <w:insideV w:val="single" w:sz="4" w:space="0" w:color="auto"/>
+        </w:tblBorders>
+      </w:tblPr>
+      <w:tr>
+        <w:tc>
+          <w:tcPr>
+            <w:tcW w:w="2400" w:type="dxa"/>
+          </w:tcPr>
+          <w:p>
+            <w:r>
+              <w:rPr>
+                <w:b/>
+              </w:rPr>
+              <w:t xml:space="preserve">Punto</w:t>
+            </w:r>
+          </w:p>
+        </w:tc>
+        <w:tc>
+          <w:tcPr>
+            <w:tcW w:w="2400" w:type="dxa"/>
+          </w:tcPr>
+          <w:p>
+            <w:r>
+              <w:rPr>
+                <w:b/>
+              </w:rPr>
+              <w:t xml:space="preserve">Stato</w:t>
+            </w:r>
+          </w:p>
+        </w:tc>
+        <w:tc>
+          <w:tcPr>
+            <w:tcW w:w="2400" w:type="dxa"/>
+          </w:tcPr>
+          <w:p>
+            <w:r>
+              <w:rPr>
+                <w:b/>
+              </w:rPr>
+              <w:t xml:space="preserve">Decisione</w:t>
+            </w:r>
+          </w:p>
+        </w:tc>
+      </w:tr>
+      <w:tr>
+        <w:tc>
+          <w:tcPr>
+            <w:tcW w:w="2400" w:type="dxa"/>
+          </w:tcPr>
+          <w:p>
+            <w:r>
+              <w:t xml:space="preserve">D2-Safety</w:t>
+            </w:r>
+          </w:p>
+        </w:tc>
+        <w:tc>
+          <w:tcPr>
+            <w:tcW w:w="2400" w:type="dxa"/>
+          </w:tcPr>
+          <w:p>
+            <w:r>
+              <w:t xml:space="preserve">valutata e fallita</w:t>
+            </w:r>
+          </w:p>
+        </w:tc>
+        <w:tc>
+          <w:tcPr>
+            <w:tcW w:w="2400" w:type="dxa"/>
+          </w:tcPr>
+          <w:p>
+            <w:r>
+              <w:t xml:space="preserve">revertita; non usare come trunk</w:t>
+            </w:r>
+          </w:p>
+        </w:tc>
+      </w:tr>
+      <w:tr>
+        <w:tc>
+          <w:tcPr>
+            <w:tcW w:w="2400" w:type="dxa"/>
+          </w:tcPr>
+          <w:p>
+            <w:r>
+              <w:t xml:space="preserve">D2</w:t>
+            </w:r>
+          </w:p>
+        </w:tc>
+        <w:tc>
+          <w:tcPr>
+            <w:tcW w:w="2400" w:type="dxa"/>
+          </w:tcPr>
+          <w:p>
+            <w:r>
+              <w:t xml:space="preserve">segnale utile su movimento/stuck+timeout, safety debole</w:t>
+            </w:r>
+          </w:p>
+        </w:tc>
+        <w:tc>
+          <w:tcPr>
+            <w:tcW w:w="2400" w:type="dxa"/>
+          </w:tcPr>
+          <w:p>
+            <w:r>
+              <w:t xml:space="preserve">mantenerla solo come base esplorativa per D3</w:t>
+            </w:r>
+          </w:p>
+        </w:tc>
+      </w:tr>
+      <w:tr>
+        <w:tc>
+          <w:tcPr>
+            <w:tcW w:w="2400" w:type="dxa"/>
+          </w:tcPr>
+          <w:p>
+            <w:r>
+              <w:t xml:space="preserve">D3</w:t>
+            </w:r>
+          </w:p>
+        </w:tc>
+        <w:tc>
+          <w:tcPr>
+            <w:tcW w:w="2400" w:type="dxa"/>
+          </w:tcPr>
+          <w:p>
+            <w:r>
+              <w:t xml:space="preserve">non presente come specifica operativa in repo/doc corrente</w:t>
+            </w:r>
+          </w:p>
+        </w:tc>
+        <w:tc>
+          <w:tcPr>
+            <w:tcW w:w="2400" w:type="dxa"/>
+          </w:tcPr>
+          <w:p>
+            <w:r>
+              <w:t xml:space="preserve">non implementare a memoria; definire patch prima del test</w:t>
+            </w:r>
+          </w:p>
+        </w:tc>
+      </w:tr>
+      <w:tr>
+        <w:tc>
+          <w:tcPr>
+            <w:tcW w:w="2400" w:type="dxa"/>
+          </w:tcPr>
+          <w:p>
+            <w:r>
+              <w:t xml:space="preserve">Path distances</w:t>
+            </w:r>
+          </w:p>
+        </w:tc>
+        <w:tc>
+          <w:tcPr>
+            <w:tcW w:w="2400" w:type="dxa"/>
+          </w:tcPr>
+          <w:p>
+            <w:r>
+              <w:t xml:space="preserve">da testare dopo ablation reward/obs</w:t>
+            </w:r>
+          </w:p>
+        </w:tc>
+        <w:tc>
+          <w:tcPr>
+            <w:tcW w:w="2400" w:type="dxa"/>
+          </w:tcPr>
+          <w:p>
+            <w:r>
+              <w:t xml:space="preserve">15/30/50 o equivalente va marcato come nuova condizione sperimentale</w:t>
+            </w:r>
+          </w:p>
+        </w:tc>
+      </w:tr>
+      <w:tr>
+        <w:tc>
+          <w:tcPr>
+            <w:tcW w:w="2400" w:type="dxa"/>
+          </w:tcPr>
+          <w:p>
+            <w:r>
+              <w:t xml:space="preserve">Budget shares</w:t>
+            </w:r>
+          </w:p>
+        </w:tc>
+        <w:tc>
+          <w:tcPr>
+            <w:tcW w:w="2400" w:type="dxa"/>
+          </w:tcPr>
+          <w:p>
+            <w:r>
+              <w:t xml:space="preserve">da testare dopo patch locali</w:t>
+            </w:r>
+          </w:p>
+        </w:tc>
+        <w:tc>
+          <w:tcPr>
+            <w:tcW w:w="2400" w:type="dxa"/>
+          </w:tcPr>
+          <w:p>
+            <w:r>
+              <w:t xml:space="preserve">30/32/38 resta proposta di consolidamento long-run</w:t>
+            </w:r>
+          </w:p>
+        </w:tc>
+      </w:tr>
+      <w:tr>
+        <w:tc>
+          <w:tcPr>
+            <w:tcW w:w="2400" w:type="dxa"/>
+          </w:tcPr>
+          <w:p>
+            <w:r>
+              <w:t xml:space="preserve">Difficulty solo path</w:t>
+            </w:r>
+          </w:p>
+        </w:tc>
+        <w:tc>
+          <w:tcPr>
+            <w:tcW w:w="2400" w:type="dxa"/>
+          </w:tcPr>
+          <w:p>
+            <w:r>
+              <w:t xml:space="preserve">non ancora testata</w:t>
+            </w:r>
+          </w:p>
+        </w:tc>
+        <w:tc>
+          <w:tcPr>
+            <w:tcW w:w="2400" w:type="dxa"/>
+          </w:tcPr>
+          <w:p>
+            <w:r>
+              <w:t xml:space="preserve">ha senso solo come variante consolidata, non nello stesso gate delle reward</w:t>
+            </w:r>
+          </w:p>
+        </w:tc>
+      </w:tr>
+    </w:tbl>
+    <w:p>
+      <w:r>
+        <w:t xml:space="preserve"/>
+      </w:r>
+    </w:p>
+    <w:p>
+      <w:r>
+        <w:rPr>
+          <w:b/>
+          <w:sz w:val="26"/>
+        </w:rPr>
+        <w:t xml:space="preserve">Gate prossima candidata</w:t>
+      </w:r>
+    </w:p>
+    <w:tbl>
+      <w:tblPr>
+        <w:tblW w:w="0" w:type="auto"/>
+        <w:tblBorders>
+          <w:top w:val="single" w:sz="4" w:space="0" w:color="auto"/>
+          <w:left w:val="single" w:sz="4" w:space="0" w:color="auto"/>
+          <w:bottom w:val="single" w:sz="4" w:space="0" w:color="auto"/>
+          <w:right w:val="single" w:sz="4" w:space="0" w:color="auto"/>
+          <w:insideH w:val="single" w:sz="4" w:space="0" w:color="auto"/>
+          <w:insideV w:val="single" w:sz="4" w:space="0" w:color="auto"/>
+        </w:tblBorders>
+      </w:tblPr>
+      <w:tr>
+        <w:tc>
+          <w:tcPr>
+            <w:tcW w:w="2400" w:type="dxa"/>
+          </w:tcPr>
+          <w:p>
+            <w:r>
+              <w:rPr>
+                <w:b/>
+              </w:rPr>
+              <w:t xml:space="preserve">Metrica vehicle</w:t>
+            </w:r>
+          </w:p>
+        </w:tc>
+        <w:tc>
+          <w:tcPr>
+            <w:tcW w:w="2400" w:type="dxa"/>
+          </w:tcPr>
+          <w:p>
+            <w:r>
+              <w:rPr>
+                <w:b/>
+              </w:rPr>
+              <w:t xml:space="preserve">Baseline</w:t>
+            </w:r>
+          </w:p>
+        </w:tc>
+        <w:tc>
+          <w:tcPr>
+            <w:tcW w:w="2400" w:type="dxa"/>
+          </w:tcPr>
+          <w:p>
+            <w:r>
+              <w:rPr>
+                <w:b/>
+              </w:rPr>
+              <w:t xml:space="preserve">Gate per prossima candidata</w:t>
+            </w:r>
+          </w:p>
+        </w:tc>
+      </w:tr>
+      <w:tr>
+        <w:tc>
+          <w:tcPr>
+            <w:tcW w:w="2400" w:type="dxa"/>
+          </w:tcPr>
+          <w:p>
+            <w:r>
+              <w:t xml:space="preserve">SR</w:t>
+            </w:r>
+          </w:p>
+        </w:tc>
+        <w:tc>
+          <w:tcPr>
+            <w:tcW w:w="2400" w:type="dxa"/>
+          </w:tcPr>
+          <w:p>
+            <w:r>
+              <w:t xml:space="preserve">20.53%</w:t>
+            </w:r>
+          </w:p>
+        </w:tc>
+        <w:tc>
+          <w:tcPr>
+            <w:tcW w:w="2400" w:type="dxa"/>
+          </w:tcPr>
+          <w:p>
+            <w:r>
+              <w:t xml:space="preserve">&gt;= 22.53% per promozione piena; almeno non sotto baseline per tenere ablation</w:t>
+            </w:r>
+          </w:p>
+        </w:tc>
+      </w:tr>
+      <w:tr>
+        <w:tc>
+          <w:tcPr>
+            <w:tcW w:w="2400" w:type="dxa"/>
+          </w:tcPr>
+          <w:p>
+            <w:r>
+              <w:t xml:space="preserve">Stuck+Timeout</w:t>
+            </w:r>
+          </w:p>
+        </w:tc>
+        <w:tc>
+          <w:tcPr>
+            <w:tcW w:w="2400" w:type="dxa"/>
+          </w:tcPr>
+          <w:p>
+            <w:r>
+              <w:t xml:space="preserve">57.14%</w:t>
+            </w:r>
+          </w:p>
+        </w:tc>
+        <w:tc>
+          <w:tcPr>
+            <w:tcW w:w="2400" w:type="dxa"/>
+          </w:tcPr>
+          <w:p>
+            <w:r>
+              <w:t xml:space="preserve">&lt;= 55.14% per gate pieno; deve restare sotto baseline</w:t>
+            </w:r>
+          </w:p>
+        </w:tc>
+      </w:tr>
+      <w:tr>
+        <w:tc>
+          <w:tcPr>
+            <w:tcW w:w="2400" w:type="dxa"/>
+          </w:tcPr>
+          <w:p>
+            <w:r>
+              <w:t xml:space="preserve">Collision</w:t>
+            </w:r>
+          </w:p>
+        </w:tc>
+        <w:tc>
+          <w:tcPr>
+            <w:tcW w:w="2400" w:type="dxa"/>
+          </w:tcPr>
+          <w:p>
+            <w:r>
+              <w:t xml:space="preserve">16.40%</w:t>
+            </w:r>
+          </w:p>
+        </w:tc>
+        <w:tc>
+          <w:tcPr>
+            <w:tcW w:w="2400" w:type="dxa"/>
+          </w:tcPr>
+          <w:p>
+            <w:r>
+              <w:t xml:space="preserve">&lt;= 17.40%</w:t>
+            </w:r>
+          </w:p>
+        </w:tc>
+      </w:tr>
+      <w:tr>
+        <w:tc>
+          <w:tcPr>
+            <w:tcW w:w="2400" w:type="dxa"/>
+          </w:tcPr>
+          <w:p>
+            <w:r>
+              <w:t xml:space="preserve">Offroad</w:t>
+            </w:r>
+          </w:p>
+        </w:tc>
+        <w:tc>
+          <w:tcPr>
+            <w:tcW w:w="2400" w:type="dxa"/>
+          </w:tcPr>
+          <w:p>
+            <w:r>
+              <w:t xml:space="preserve">5.93%</w:t>
+            </w:r>
+          </w:p>
+        </w:tc>
+        <w:tc>
+          <w:tcPr>
+            <w:tcW w:w="2400" w:type="dxa"/>
+          </w:tcPr>
+          <w:p>
+            <w:r>
+              <w:t xml:space="preserve">&lt;= 6.93%</w:t>
+            </w:r>
+          </w:p>
+        </w:tc>
+      </w:tr>
+    </w:tbl>
+    <w:p>
+      <w:r>
+        <w:t xml:space="preserve"/>
+      </w:r>
+    </w:p>
+    <w:p>
+      <w:r>
+        <w:rPr>
+          <w:b/>
+          <w:sz w:val="26"/>
+        </w:rPr>
+        <w:t xml:space="preserve">Valutazione critica OBS/Reward</w:t>
+      </w:r>
+    </w:p>
+    <w:p>
+      <w:r>
+        <w:t xml:space="preserve">Non abbiamo evidenza empirica che nuove OBS generiche migliorino i veicoli. D1 era una OBS mirata e ha peggiorato; quindi aggiungere altre OBS ora senza ipotesi stretta aumenta il rischio di rumore e invalida confronti.</w:t>
+      </w:r>
+    </w:p>
+    <w:p>
+      <w:r>
+        <w:t xml:space="preserve">Non abbiamo evidenza che safety shaping semplice risolva collision/offroad: D2-Safety ha fallito. Il problema non sembra solo mancanza di penalita safety nella reward.</w:t>
+      </w:r>
+    </w:p>
+    <w:p>
+      <w:r>
+        <w:t xml:space="preserve">Le reward di movimento funzionano solo parzialmente: D2 riduce stuck+timeout e aumenta speed, ma sposta errori verso collision/offroad. Quindi il collo di bottiglia attuale e trade-off movimento-sicurezza, non solo velocita bassa.</w:t>
+      </w:r>
+    </w:p>
+    <w:p>
+      <w:r>
+        <w:t xml:space="preserve">Best practice gia coperte in modo compatibile col vincolo architetturale: progress dense, waypoint bonus, idle/no-advance pressure, route-aligned geometry, hazard risk gating, red/yellow light exception, diagnostica agent-level.</w:t>
+      </w:r>
+    </w:p>
+    <w:p>
+      <w:r>
+        <w:t xml:space="preserve">Prossime modifiche sensate devono essere ablation piccole e falsificabili. Le variazioni di path length, budget shares e difficulty solo path vanno trattate come nuova condizione sperimentale di curriculum, non come fix reward.</w:t>
+      </w:r>
+    </w:p>
+    <w:p>
+      <w:r>
+        <w:t xml:space="preserve"/>
+      </w:r>
+    </w:p>
+    <w:p>
+      <w:r>
+        <w:rPr>
+          <w:b/>
+          <w:sz w:val="26"/>
+        </w:rPr>
+        <w:t xml:space="preserve">Comando run D2-only/D3 quando definita</w:t>
       </w:r>
     </w:p>
     <w:p>

</xml_diff>

<commit_message>
UpdateDoc&PlanD2+D3(TESTING)   - aggiunta config D3:       - terminate_vehicle_on_early_stuck: True       - vehicle_early_stuck_no_wp_steps: 300       - vehicle_early_stuck_route_completion_threshold: 0.3       - vehicle_early_stuck_hazard_threshold: 0.75   - aggiunta helper _is_vehicle_early_stuck   - termination anticipata solo per veicoli se:       - no_wp_steps >= 300       - e route_completion < 0.3 oppure loop_penalty_active       - non e' fermo a semaforo rosso/giallo       - non ha hazard route davanti >= 0.75   - gli agenti chiusi da D3 vengono registrati come termination_reason = "stuck"   - OBS invariata: VEHICLE_OBS_DIM = 44, global obs invariata.
</commit_message>
<xml_diff>
--- a/reports/carla_finetuning_maggio_2026.docx
+++ b/reports/carla_finetuning_maggio_2026.docx
@@ -2229,7 +2229,7 @@
           <w:b/>
           <w:sz w:val="26"/>
         </w:rPr>
-        <w:t xml:space="preserve">Comando run D2-only/D3 quando definita</w:t>
+        <w:t xml:space="preserve">Comando run D2+D3</w:t>
       </w:r>
     </w:p>
     <w:p>
@@ -2240,6 +2240,56 @@
     <w:p>
       <w:r>
         <w:t xml:space="preserve"/>
+      </w:r>
+    </w:p>
+    <w:p>
+      <w:r>
+        <w:t xml:space="preserve"/>
+      </w:r>
+    </w:p>
+    <w:p>
+      <w:r>
+        <w:t xml:space="preserve">Aggiornamento 2026-05-14 - D3 implementata</w:t>
+      </w:r>
+    </w:p>
+    <w:p>
+      <w:r>
+        <w:t xml:space="preserve">Stato corrente: C0+C1+D2+D3 attivi; D1 e D2-Safety restano revertite.</w:t>
+      </w:r>
+    </w:p>
+    <w:p>
+      <w:r>
+        <w:t xml:space="preserve">D3: early termination stuck per soli veicoli. La termination scatta se no_wp_steps &gt;= 300 e route_completion &lt; 0.3 oppure loop_penalty_active.</w:t>
+      </w:r>
+    </w:p>
+    <w:p>
+      <w:r>
+        <w:t xml:space="preserve">Guardrail D3: non termina se il veicolo e fermo a semaforo rosso/giallo; non termina se hazard route davanti &gt;= 0.75.</w:t>
+      </w:r>
+    </w:p>
+    <w:p>
+      <w:r>
+        <w:t xml:space="preserve">Reason D3: gli agenti chiusi da early termination vengono registrati come termination_reason=stuck.</w:t>
+      </w:r>
+    </w:p>
+    <w:p>
+      <w:r>
+        <w:t xml:space="preserve">Impatto D3: non cambia reward, OBS, VEHICLE_OBS_DIM o global_obs; cambia la dinamica di training e va marcata nei risultati.</w:t>
+      </w:r>
+    </w:p>
+    <w:p>
+      <w:r>
+        <w:t xml:space="preserve">Gate D3: SR vehicle deve salire; stuck+timeout vehicle deve scendere; collision/offroad non devono peggiorare oltre +1 pp; integrita episodes.jsonl 6 record per episodio e no NaN/inf.</w:t>
+      </w:r>
+    </w:p>
+    <w:p>
+      <w:r>
+        <w:t xml:space="preserve">D4: pending. Fallback OBS 47D con is_junction_current, is_junction_next e lane_change_available; richiede training nuovo e checkpoint incompatibili.</w:t>
+      </w:r>
+    </w:p>
+    <w:p>
+      <w:r>
+        <w:t xml:space="preserve">E1-E4: pending dopo D3/D4. Scaling path 15/30/50 m, budget 30/32/38, ricalcolo pesi e difficulty solo path come nuova condizione curriculum.</w:t>
       </w:r>
     </w:p>
     <w:sectPr>

</xml_diff>

<commit_message>
PlanR1&UpdateContextAndDocs - rimossa route_completion = self._route_completion(ad) (ora variabile inutilizzata — verificato: nessun altro uso nella funzione);   - if safe_to_push and route_completion < 0.3 and alignment > 0.25: → if safe_to_push and alignment > 0.25: (start/unblock shaping);   - stessa modifica sul secondo gate (speed shaping target_min_speed=8.0).
</commit_message>
<xml_diff>
--- a/reports/carla_finetuning_maggio_2026.docx
+++ b/reports/carla_finetuning_maggio_2026.docx
@@ -8980,7 +8980,7 @@
           </w:tcPr>
           <w:p>
             <w:r>
-              <w:t>Obs hazard-perception</w:t>
+              <w:t>R1</w:t>
             </w:r>
           </w:p>
         </w:tc>
@@ -8990,7 +8990,7 @@
           </w:tcPr>
           <w:p>
             <w:r>
-              <w:t>pending (approvato, non progettato)</w:t>
+              <w:t>pending (prossimo)</w:t>
             </w:r>
           </w:p>
         </w:tc>
@@ -9010,7 +9010,133 @@
           </w:tcPr>
           <w:p>
             <w:r>
-              <w:t>Cambio osservazione veicolo: feature di percezione hazard / agenti vicini. Attacca il limite di percezione emerso da R3. Cambia lo spazio osservazione 44D; non checkpoint-comparabile. Non ancora progettato.</w:t>
+              <w:t>Reward shaping: rimuove il gate route_completion &lt; 0.3 in _vehicle_reward (carla_multi_agent_env.py ~1760/1782/1788), cosi lo shaping start/unblock e velocita resta attivo per tutta la rotta. Mira al fallimento dominante stuck+timeout. Checkpoint-comparabile; A/B single-knob vs run 20260516_200545. Vedi PROPOSED_PLAN.md Punto 3.</w:t>
+            </w:r>
+          </w:p>
+        </w:tc>
+      </w:tr>
+      <w:tr>
+        <w:tc>
+          <w:tcPr>
+            <w:tcW w:type="dxa" w:w="1399"/>
+          </w:tcPr>
+          <w:p>
+            <w:r>
+              <w:t>R2</w:t>
+            </w:r>
+          </w:p>
+        </w:tc>
+        <w:tc>
+          <w:tcPr>
+            <w:tcW w:type="dxa" w:w="1700"/>
+          </w:tcPr>
+          <w:p>
+            <w:r>
+              <w:t>pending</w:t>
+            </w:r>
+          </w:p>
+        </w:tc>
+        <w:tc>
+          <w:tcPr>
+            <w:tcW w:type="dxa" w:w="1699"/>
+          </w:tcPr>
+          <w:p>
+            <w:r>
+              <w:t>-</w:t>
+            </w:r>
+          </w:p>
+        </w:tc>
+        <w:tc>
+          <w:tcPr>
+            <w:tcW w:type="dxa" w:w="4227"/>
+          </w:tcPr>
+          <w:p>
+            <w:r>
+              <w:t>Reward shaping: il bonus di sterzo fluido +0.1 in _vehicle_reward (carla_multi_agent_env.py:1803) viene pagato solo se speed_kmh &gt; 5.0, cosi un veicolo fermo non lo incassa piu. Checkpoint-comparabile. Vedi PROPOSED_PLAN.md Punto 4.</w:t>
+            </w:r>
+          </w:p>
+        </w:tc>
+      </w:tr>
+      <w:tr>
+        <w:tc>
+          <w:tcPr>
+            <w:tcW w:type="dxa" w:w="1399"/>
+          </w:tcPr>
+          <w:p>
+            <w:r>
+              <w:t>Route-len bugfix</w:t>
+            </w:r>
+          </w:p>
+        </w:tc>
+        <w:tc>
+          <w:tcPr>
+            <w:tcW w:type="dxa" w:w="1700"/>
+          </w:tcPr>
+          <w:p>
+            <w:r>
+              <w:t>pending</w:t>
+            </w:r>
+          </w:p>
+        </w:tc>
+        <w:tc>
+          <w:tcPr>
+            <w:tcW w:type="dxa" w:w="1699"/>
+          </w:tcPr>
+          <w:p>
+            <w:r>
+              <w:t>-</w:t>
+            </w:r>
+          </w:p>
+        </w:tc>
+        <w:tc>
+          <w:tcPr>
+            <w:tcW w:type="dxa" w:w="4227"/>
+          </w:tcPr>
+          <w:p>
+            <w:r>
+              <w:t>Bugfix env: enforce dell upper bound 2.0x sulla lunghezza rotta veicolo in route_planner.py plan_vehicle_route (~184); oggi e controllato solo il lower bound 0.5x. Checkpoint-comparabile; A/B separato (cambia la distribuzione della lunghezza rotta). Vedi PROPOSED_PLAN.md Punto 5.</w:t>
+            </w:r>
+          </w:p>
+        </w:tc>
+      </w:tr>
+      <w:tr>
+        <w:tc>
+          <w:tcPr>
+            <w:tcW w:type="dxa" w:w="1399"/>
+          </w:tcPr>
+          <w:p>
+            <w:r>
+              <w:t>O1+O2</w:t>
+            </w:r>
+          </w:p>
+        </w:tc>
+        <w:tc>
+          <w:tcPr>
+            <w:tcW w:type="dxa" w:w="1700"/>
+          </w:tcPr>
+          <w:p>
+            <w:r>
+              <w:t>pending (cambio obs; per ultimo)</w:t>
+            </w:r>
+          </w:p>
+        </w:tc>
+        <w:tc>
+          <w:tcPr>
+            <w:tcW w:type="dxa" w:w="1699"/>
+          </w:tcPr>
+          <w:p>
+            <w:r>
+              <w:t>-</w:t>
+            </w:r>
+          </w:p>
+        </w:tc>
+        <w:tc>
+          <w:tcPr>
+            <w:tcW w:type="dxa" w:w="4227"/>
+          </w:tcPr>
+          <w:p>
+            <w:r>
+              <w:t>Osservazione veicolo 44D -&gt; 47D: O1 aggiunge no_wp_steps normalizzato + flag loop_penalty_active, O2 aggiunge il tempo residuo normalizzato. Fix di state-aliasing di Markov, non feature di percezione hazard. Non checkpoint-comparabile; unica variante 47D con retrain da zero. Vedi PROPOSED_PLAN.md Punti 6-7.</w:t>
             </w:r>
           </w:p>
         </w:tc>
@@ -9852,12 +9978,12 @@
     </w:p>
     <w:p>
       <w:r>
-        <w:t>Lettura R3: la penalita 10 volte piu grande NON ha ridotto le collisioni (-0.23 pp). L ipotesi che il tasso di collisione sia tunabile via la magnitudo della penalita collisione e falsificata. La policy ha risposto al cambio di reward su altri assi (offroad -3.32 pp; stuck -7.17 pp convertito in timeout +9.45 pp; route completion media 0.44-&gt;0.50) ma non sull asse collisione: l evitamento delle collisioni non e apprendibile dall osservazione veicolo 44D attuale, e un limite di percezione e non di peso del reward. Lo shaping di reward sull asse collisione e esaurito. Non promosso; -500 tenuto (non revertato) per decisione utente come base dell esperimento osservazione.</w:t>
-      </w:r>
-    </w:p>
-    <w:p>
-      <w:r>
-        <w:t>Quadro e prossimo passo. Con la serie D (D1/D2/D3), la serie H (H1/H2/H3) e R3, gli assi ottimizzatore e reward per la vehicle policy risultano esauriti: la SR veicoli resta su un plateau di circa 21-23%. Il vincolo binding (collision circa 25.6%) non e tunabile via reward. Prossimo candidato pianificato, approvato dall utente come variante sperimentale separata: cambio dell osservazione veicolo con feature di percezione hazard / agenti vicini, per attaccare il limite di percezione individuato. Cambia lo spazio osservazione veicolo (attualmente 44D) e non e checkpoint-comparabile con le run precedenti. Non ancora progettato.</w:t>
+        <w:t>Lettura R3: la penalita 10 volte piu grande NON ha ridotto le collisioni (-0.23 pp). L ipotesi che il tasso di collisione sia tunabile via la magnitudo della penalita collisione e falsificata. La policy ha risposto al cambio di reward su altri assi (offroad -3.32 pp; stuck -7.17 pp convertito in timeout +9.45 pp; route completion media 0.44-&gt;0.50) ma non sull asse collisione: l evitamento delle collisioni non e apprendibile dall osservazione veicolo 44D attuale, e un limite di percezione e non di peso del reward. Lo shaping di reward sulla magnitudo della penalita collisione e esaurito; R1 e R2 restano candidati di reward shaping non ancora testati, mirati al fallimento dominante stuck+timeout. Non promosso; -500 tenuto (non revertato) per decisione utente come base sperimentale del prossimo candidato R1.</w:t>
+      </w:r>
+    </w:p>
+    <w:p>
+      <w:r>
+        <w:t>Quadro e prossimo passo. Con la serie D (D1/D2/D3), la serie H (H1/H2/H3) e R3, gli assi ottimizzatore e la magnitudo della penalita collisione per la vehicle policy risultano esauriti: la SR veicoli resta su un plateau di circa 21-23%. Il vincolo binding sull asse collisione (circa 25.6%) non e tunabile via la magnitudo della penalita. I prossimi candidati pianificati, nell ordine di PROPOSED_PLAN.md, sono: R1 (rimozione del gate reward route_completion &lt; 0.3 in _vehicle_reward), R2 (bonus di sterzo fluido condizionato a speed_kmh &gt; 5), il bugfix dell upper bound di route_planner (lunghezza rotta entro 2.0x del target) e O1+O2 (osservazione veicolo 44D -&gt; 47D: no_wp_steps normalizzato, loop flag, tempo residuo). R1, R2 e il bugfix sono checkpoint-comparabili; O1+O2 cambiano lo spazio osservazione veicolo, non sono checkpoint-comparabili e vanno applicati per ultimi come unica variante 47D con retrain da zero. O1+O2 sono fix di state-aliasing di Markov (la reward usa gia no_wp_steps e loop_penalty_active e l episodio e troncato a orizzonte fisso), non feature di percezione hazard. Il candidato immediatamente successivo e R1.</w:t>
       </w:r>
     </w:p>
     <w:p>

</xml_diff>

<commit_message>
PlanR4&UpdateContextAndDocs   +        if steer_delta < 0.1 and speed_kmh > 5.0:   +            reward += 0.1   # smooth driving bonus (only when the vehicle is moving)
</commit_message>
<xml_diff>
--- a/reports/carla_finetuning_maggio_2026.docx
+++ b/reports/carla_finetuning_maggio_2026.docx
@@ -8990,7 +8990,7 @@
           </w:tcPr>
           <w:p>
             <w:r>
-              <w:t>applicato (commit 721fc2e); run A/B da lanciare</w:t>
+              <w:t>promosso (trunk); gate veicoli 4/4</w:t>
             </w:r>
           </w:p>
         </w:tc>
@@ -9010,7 +9010,7 @@
           </w:tcPr>
           <w:p>
             <w:r>
-              <w:t>Reward shaping: rimuove il gate route_completion &lt; 0.3 in _vehicle_reward (carla_multi_agent_env.py ~1760/1782/1788), cosi lo shaping start/unblock e velocita resta attivo per tutta la rotta. Mira al fallimento dominante stuck+timeout. Checkpoint-comparabile; A/B single-knob vs run 20260516_200545. Vedi PROPOSED_PLAN.md Punto 3. Codice applicato (commit 721fc2e, 3 micro-edit, compileall OK e git diff --check puliti); non ancora eseguito ne valutato.</w:t>
+              <w:t>Reward shaping: rimosso il gate route_completion &lt; 0.3 in _vehicle_reward, lo shaping start/unblock e velocita resta attivo per tutta la rotta. A/B single-knob vs R3 20260516_200545. Gate veicoli PASSA 4/4: SR +4.69 pp (22.70-&gt;27.38), stuck+timeout -3.45 pp (46.63-&gt;43.18), collision -1.46 pp, offroad +0.22 pp. +45 route-complete in valore assoluto; integrita OK (1950 record, 0 dup, 0 NaN/inf). Pedoni (separati): SR -4.03 pp, probabile rumore, da confermare con seed. Primo PASS dopo D2: promosso, base per R2.</w:t>
             </w:r>
           </w:p>
         </w:tc>
@@ -9983,7 +9983,12 @@
     </w:p>
     <w:p>
       <w:r>
-        <w:t>Quadro e prossimo passo. Con la serie D (D1/D2/D3), la serie H (H1/H2/H3) e R3, gli assi ottimizzatore e la magnitudo della penalita collisione per la vehicle policy risultano esauriti: la SR veicoli resta su un plateau di circa 21-23%. Il vincolo binding sull asse collisione (circa 25.6%) non e tunabile via la magnitudo della penalita. I prossimi candidati pianificati, nell ordine di PROPOSED_PLAN.md, sono: R1 (rimozione del gate reward route_completion &lt; 0.3 in _vehicle_reward), R2 (bonus di sterzo fluido condizionato a speed_kmh &gt; 5), il bugfix dell upper bound di route_planner (lunghezza rotta entro 2.0x del target) e O1+O2 (osservazione veicolo 44D -&gt; 47D: no_wp_steps normalizzato, loop flag, tempo residuo). R1, R2 e il bugfix sono checkpoint-comparabili; O1+O2 cambiano lo spazio osservazione veicolo, non sono checkpoint-comparabili e vanno applicati per ultimi come unica variante 47D con retrain da zero. O1+O2 sono fix di state-aliasing di Markov (la reward usa gia no_wp_steps e loop_penalty_active e l episodio e troncato a orizzonte fisso), non feature di percezione hazard. Il candidato immediatamente successivo e R1, il cui codice e gia applicato (commit 721fc2e, 3 micro-edit in _vehicle_reward, compileall OK e git diff --check puliti) e in attesa della run A/B vs 20260516_200545; R2, il bugfix e O1+O2 restano pending.</w:t>
+        <w:t>R1 - run carla_mappo_20260517_134652. Rimosso il gate route_completion &lt; 0.3 in _vehicle_reward (lo shaping start/unblock e di velocita resta attivo per tutta la rotta), sulla base R3; A/B single-knob vs 20260516_200545 (seed 999, easy-lock, ~300k). Gate veicoli (cumulativo da episodes.jsonl): PASSA 4 su 4 - SR +4.69 pp (22.70-&gt;27.38), stuck+timeout -3.45 pp (46.63-&gt;43.18), collision -1.46 pp (25.56-&gt;24.10), offroad +0.22 pp (5.11-&gt;5.33). Integrita OK (325 episodi per 6 = 1950 record, 0 duplicati, 0 NaN/inf). On-mechanism: route-complete +45 in valore assoluto (222-&gt;267, non effetto-denominatore); la coorte timeout e il contributo maggiore (-2.71 pp); speed veicolo 11.53-&gt;13.04 km/h; il canary collisione migliora invece di peggiorare; nessun decadimento tardivo della SR. Pedoni (separati): SR 89.06-&gt;85.03 (-4.03 pp), stuck +4.23 pp - R1 non tocca _pedestrian_reward; probabile rumore run-to-run (SR pedoni 84.7-89.1 nelle ultime 4 run), da confermare con seed aggiuntivi. R1 e il primo candidato a superare il gate dopo D2: promosso nel trunk, base per R2.</w:t>
+      </w:r>
+    </w:p>
+    <w:p>
+      <w:r>
+        <w:t>Quadro e prossimo passo. R1 e promosso: primo PASS del gate veicoli dopo D2. Il trunk attivo diventa C0 + C1 + D2 + R1 (sulla base sperimentale H1+H2+H3+R3 mantenuta). Prossimi candidati pianificati, nell ordine di PROPOSED_PLAN.md: R2 (bonus di sterzo fluido condizionato a speed_kmh &gt; 5), il bugfix dell upper bound di route_planner (lunghezza rotta entro 2.0x del target) e O1+O2 (osservazione veicolo 44D -&gt; 47D, fix di state-aliasing di Markov, per ultimi con retrain da zero). R2 e il bugfix sono checkpoint-comparabili. Il candidato immediatamente successivo e R2, A/B single-knob sulla base R1. Resta consigliata una conferma multi-seed di R1, in particolare per chiarire se il calo della SR pedoni e rumore.</w:t>
       </w:r>
     </w:p>
     <w:p>

</xml_diff>

<commit_message>
Add episode classification and evaluation scripts for CARLA MAPPO training
- Introduced `episode_classification.py` to classify episode termination reasons based on agent states and route metrics.
- Added `evaluate_run_static.py` for static evaluation of training runs, processing `episodes.jsonl` to compute cumulative metrics and breakdowns.
- Implemented unit tests in `test_episode_classification.py` to validate the classification logic without CARLA dependencies.
- Updated report generation to include detailed metrics for vehicles and pedestrians, including route source distribution and level breakdowns.
- Enhanced termination reason logic to include new conditions for route completion and short routes based on optimal length ratios.
</commit_message>
<xml_diff>
--- a/reports/carla_finetuning_maggio_2026.docx
+++ b/reports/carla_finetuning_maggio_2026.docx
@@ -1830,8 +1830,8 @@
         <w:gridCol w:w="1455"/>
         <w:gridCol w:w="1454"/>
         <w:gridCol w:w="1454"/>
-        <w:gridCol w:w="1457"/>
-        <w:gridCol w:w="1447"/>
+        <w:gridCol w:w="1459"/>
+        <w:gridCol w:w="1445"/>
       </w:tblGrid>
       <w:tr>
         <w:trPr/>
@@ -2646,7 +2646,7 @@
         </w:tc>
         <w:tc>
           <w:tcPr>
-            <w:tcW w:w="1457" w:type="dxa"/>
+            <w:tcW w:w="1459" w:type="dxa"/>
             <w:tcBorders/>
             <w:shd w:fill="1F4E79"/>
             <w:vAlign w:val="center"/>
@@ -2682,7 +2682,7 @@
         </w:tc>
         <w:tc>
           <w:tcPr>
-            <w:tcW w:w="1447" w:type="dxa"/>
+            <w:tcW w:w="1445" w:type="dxa"/>
             <w:tcBorders/>
             <w:shd w:fill="1F4E79"/>
             <w:vAlign w:val="center"/>
@@ -2993,7 +2993,7 @@
         </w:tc>
         <w:tc>
           <w:tcPr>
-            <w:tcW w:w="1457" w:type="dxa"/>
+            <w:tcW w:w="1459" w:type="dxa"/>
             <w:tcBorders/>
             <w:vAlign w:val="center"/>
           </w:tcPr>
@@ -3027,7 +3027,7 @@
         </w:tc>
         <w:tc>
           <w:tcPr>
-            <w:tcW w:w="1447" w:type="dxa"/>
+            <w:tcW w:w="1445" w:type="dxa"/>
             <w:tcBorders/>
             <w:vAlign w:val="center"/>
           </w:tcPr>
@@ -3344,7 +3344,7 @@
         </w:tc>
         <w:tc>
           <w:tcPr>
-            <w:tcW w:w="1457" w:type="dxa"/>
+            <w:tcW w:w="1459" w:type="dxa"/>
             <w:tcBorders/>
             <w:shd w:fill="F3F6FA"/>
             <w:vAlign w:val="center"/>
@@ -3379,7 +3379,7 @@
         </w:tc>
         <w:tc>
           <w:tcPr>
-            <w:tcW w:w="1447" w:type="dxa"/>
+            <w:tcW w:w="1445" w:type="dxa"/>
             <w:tcBorders/>
             <w:shd w:fill="F3F6FA"/>
             <w:vAlign w:val="center"/>
@@ -3689,7 +3689,7 @@
         </w:tc>
         <w:tc>
           <w:tcPr>
-            <w:tcW w:w="1457" w:type="dxa"/>
+            <w:tcW w:w="1459" w:type="dxa"/>
             <w:tcBorders/>
             <w:vAlign w:val="center"/>
           </w:tcPr>
@@ -3723,7 +3723,7 @@
         </w:tc>
         <w:tc>
           <w:tcPr>
-            <w:tcW w:w="1447" w:type="dxa"/>
+            <w:tcW w:w="1445" w:type="dxa"/>
             <w:tcBorders/>
             <w:vAlign w:val="center"/>
           </w:tcPr>
@@ -4040,7 +4040,7 @@
         </w:tc>
         <w:tc>
           <w:tcPr>
-            <w:tcW w:w="1457" w:type="dxa"/>
+            <w:tcW w:w="1459" w:type="dxa"/>
             <w:tcBorders/>
             <w:shd w:fill="F3F6FA"/>
             <w:vAlign w:val="center"/>
@@ -4075,7 +4075,7 @@
         </w:tc>
         <w:tc>
           <w:tcPr>
-            <w:tcW w:w="1447" w:type="dxa"/>
+            <w:tcW w:w="1445" w:type="dxa"/>
             <w:tcBorders/>
             <w:shd w:fill="F3F6FA"/>
             <w:vAlign w:val="center"/>
@@ -11877,430 +11877,6 @@
               <w:suppressAutoHyphens w:val="true"/>
               <w:spacing w:lineRule="auto" w:line="240" w:before="0" w:after="0"/>
               <w:jc w:val="center"/>
-              <w:rPr/>
-            </w:pPr>
-            <w:r>
-              <w:rPr>
-                <w:rFonts w:cs="" w:ascii="Calibri" w:hAnsi="Calibri"/>
-                <w:b w:val="false"/>
-                <w:kern w:val="0"/>
-                <w:sz w:val="20"/>
-                <w:szCs w:val="20"/>
-                <w:lang w:val="it-IT" w:eastAsia="en-US" w:bidi="ar-SA"/>
-              </w:rPr>
-              <w:t xml:space="preserve">Full curr. / </w:t>
-            </w:r>
-            <w:r>
-              <w:rPr>
-                <w:rFonts w:cs="" w:ascii="Calibri" w:hAnsi="Calibri"/>
-                <w:b w:val="false"/>
-                <w:kern w:val="0"/>
-                <w:sz w:val="20"/>
-                <w:szCs w:val="20"/>
-                <w:shd w:fill="FFFF00" w:val="clear"/>
-                <w:lang w:val="it-IT" w:eastAsia="en-US" w:bidi="ar-SA"/>
-              </w:rPr>
-              <w:t xml:space="preserve">3M Steps </w:t>
-            </w:r>
-            <w:r>
-              <w:rPr>
-                <w:rFonts w:cs="" w:ascii="Calibri" w:hAnsi="Calibri"/>
-                <w:b w:val="false"/>
-                <w:kern w:val="0"/>
-                <w:sz w:val="20"/>
-                <w:szCs w:val="20"/>
-                <w:lang w:val="it-IT" w:eastAsia="en-US" w:bidi="ar-SA"/>
-              </w:rPr>
-              <w:t xml:space="preserve">/ </w:t>
-            </w:r>
-            <w:r>
-              <w:rPr>
-                <w:rFonts w:cs="" w:ascii="Calibri" w:hAnsi="Calibri"/>
-                <w:b w:val="false"/>
-                <w:kern w:val="0"/>
-                <w:sz w:val="20"/>
-                <w:szCs w:val="20"/>
-                <w:shd w:fill="FFDE59" w:val="clear"/>
-                <w:lang w:val="it-IT" w:eastAsia="en-US" w:bidi="ar-SA"/>
-              </w:rPr>
-              <w:t>LvsDiff 30;60;100</w:t>
-            </w:r>
-          </w:p>
-        </w:tc>
-        <w:tc>
-          <w:tcPr>
-            <w:tcW w:w="1119" w:type="dxa"/>
-            <w:tcBorders/>
-            <w:shd w:fill="F3F6FA"/>
-            <w:vAlign w:val="center"/>
-          </w:tcPr>
-          <w:p>
-            <w:pPr>
-              <w:pStyle w:val="Normal"/>
-              <w:widowControl/>
-              <w:suppressAutoHyphens w:val="true"/>
-              <w:spacing w:lineRule="auto" w:line="240" w:before="0" w:after="0"/>
-              <w:jc w:val="center"/>
-              <w:rPr/>
-            </w:pPr>
-            <w:r>
-              <w:rPr>
-                <w:rFonts w:cs="" w:ascii="Calibri" w:hAnsi="Calibri"/>
-                <w:b w:val="false"/>
-                <w:kern w:val="0"/>
-                <w:sz w:val="21"/>
-                <w:szCs w:val="21"/>
-                <w:lang w:val="it-IT" w:eastAsia="en-US" w:bidi="ar-SA"/>
-              </w:rPr>
-              <w:t>carla_mappo_20260519_001217</w:t>
-            </w:r>
-          </w:p>
-        </w:tc>
-        <w:tc>
-          <w:tcPr>
-            <w:tcW w:w="1119" w:type="dxa"/>
-            <w:tcBorders/>
-            <w:shd w:fill="F3F6FA"/>
-            <w:vAlign w:val="center"/>
-          </w:tcPr>
-          <w:p>
-            <w:pPr>
-              <w:pStyle w:val="Normal"/>
-              <w:widowControl/>
-              <w:suppressAutoHyphens w:val="true"/>
-              <w:spacing w:lineRule="auto" w:line="240" w:before="0" w:after="0"/>
-              <w:jc w:val="center"/>
-              <w:rPr>
-                <w:highlight w:val="none"/>
-                <w:shd w:fill="auto" w:val="clear"/>
-              </w:rPr>
-            </w:pPr>
-            <w:r>
-              <w:rPr>
-                <w:rFonts w:cs="" w:ascii="Calibri" w:hAnsi="Calibri"/>
-                <w:b w:val="false"/>
-                <w:kern w:val="0"/>
-                <w:sz w:val="21"/>
-                <w:szCs w:val="21"/>
-                <w:shd w:fill="auto" w:val="clear"/>
-                <w:lang w:val="it-IT" w:eastAsia="en-US" w:bidi="ar-SA"/>
-              </w:rPr>
-              <w:t>training OK</w:t>
-            </w:r>
-          </w:p>
-        </w:tc>
-        <w:tc>
-          <w:tcPr>
-            <w:tcW w:w="1119" w:type="dxa"/>
-            <w:tcBorders/>
-            <w:shd w:fill="F3F6FA"/>
-            <w:vAlign w:val="center"/>
-          </w:tcPr>
-          <w:p>
-            <w:pPr>
-              <w:pStyle w:val="Normal"/>
-              <w:widowControl/>
-              <w:suppressAutoHyphens w:val="true"/>
-              <w:spacing w:lineRule="auto" w:line="240" w:before="0" w:after="0"/>
-              <w:jc w:val="center"/>
-              <w:rPr/>
-            </w:pPr>
-            <w:r>
-              <w:rPr>
-                <w:rFonts w:cs="" w:ascii="Calibri" w:hAnsi="Calibri"/>
-                <w:b w:val="false"/>
-                <w:kern w:val="0"/>
-                <w:sz w:val="21"/>
-                <w:szCs w:val="21"/>
-                <w:lang w:val="it-IT" w:eastAsia="en-US" w:bidi="ar-SA"/>
-              </w:rPr>
-              <w:t>3393</w:t>
-            </w:r>
-          </w:p>
-        </w:tc>
-        <w:tc>
-          <w:tcPr>
-            <w:tcW w:w="1118" w:type="dxa"/>
-            <w:tcBorders/>
-            <w:shd w:fill="F3F6FA"/>
-            <w:vAlign w:val="center"/>
-          </w:tcPr>
-          <w:p>
-            <w:pPr>
-              <w:pStyle w:val="Normal"/>
-              <w:widowControl/>
-              <w:suppressAutoHyphens w:val="true"/>
-              <w:spacing w:lineRule="auto" w:line="240" w:before="0" w:after="0"/>
-              <w:jc w:val="center"/>
-              <w:rPr/>
-            </w:pPr>
-            <w:r>
-              <w:rPr>
-                <w:rFonts w:cs="" w:ascii="Calibri" w:hAnsi="Calibri"/>
-                <w:b w:val="false"/>
-                <w:kern w:val="0"/>
-                <w:sz w:val="21"/>
-                <w:szCs w:val="21"/>
-                <w:lang w:val="it-IT" w:eastAsia="en-US" w:bidi="ar-SA"/>
-              </w:rPr>
-              <w:t>20358</w:t>
-            </w:r>
-          </w:p>
-        </w:tc>
-        <w:tc>
-          <w:tcPr>
-            <w:tcW w:w="1119" w:type="dxa"/>
-            <w:tcBorders/>
-            <w:shd w:fill="F3F6FA"/>
-            <w:vAlign w:val="center"/>
-          </w:tcPr>
-          <w:p>
-            <w:pPr>
-              <w:pStyle w:val="Normal"/>
-              <w:widowControl/>
-              <w:suppressAutoHyphens w:val="true"/>
-              <w:spacing w:lineRule="auto" w:line="240" w:before="0" w:after="0"/>
-              <w:jc w:val="center"/>
-              <w:rPr/>
-            </w:pPr>
-            <w:r>
-              <w:rPr>
-                <w:rFonts w:cs="" w:ascii="Calibri" w:hAnsi="Calibri"/>
-                <w:b w:val="false"/>
-                <w:kern w:val="0"/>
-                <w:sz w:val="21"/>
-                <w:szCs w:val="21"/>
-                <w:lang w:val="it-IT" w:eastAsia="en-US" w:bidi="ar-SA"/>
-              </w:rPr>
-              <w:t>225</w:t>
-            </w:r>
-          </w:p>
-        </w:tc>
-        <w:tc>
-          <w:tcPr>
-            <w:tcW w:w="1119" w:type="dxa"/>
-            <w:tcBorders/>
-            <w:shd w:fill="F3F6FA"/>
-            <w:vAlign w:val="center"/>
-          </w:tcPr>
-          <w:p>
-            <w:pPr>
-              <w:pStyle w:val="Normal"/>
-              <w:widowControl/>
-              <w:suppressAutoHyphens w:val="true"/>
-              <w:spacing w:lineRule="auto" w:line="240" w:before="0" w:after="0"/>
-              <w:jc w:val="center"/>
-              <w:rPr/>
-            </w:pPr>
-            <w:r>
-              <w:rPr>
-                <w:rFonts w:cs="" w:ascii="Calibri" w:hAnsi="Calibri"/>
-                <w:b w:val="false"/>
-                <w:kern w:val="0"/>
-                <w:sz w:val="21"/>
-                <w:szCs w:val="21"/>
-                <w:lang w:val="it-IT" w:eastAsia="en-US" w:bidi="ar-SA"/>
-              </w:rPr>
-              <w:t>3005318</w:t>
-            </w:r>
-          </w:p>
-        </w:tc>
-        <w:tc>
-          <w:tcPr>
-            <w:tcW w:w="1119" w:type="dxa"/>
-            <w:tcBorders/>
-            <w:shd w:fill="F3F6FA"/>
-            <w:vAlign w:val="center"/>
-          </w:tcPr>
-          <w:p>
-            <w:pPr>
-              <w:pStyle w:val="Normal"/>
-              <w:widowControl/>
-              <w:suppressAutoHyphens w:val="true"/>
-              <w:spacing w:lineRule="auto" w:line="240" w:before="0" w:after="0"/>
-              <w:jc w:val="center"/>
-              <w:rPr/>
-            </w:pPr>
-            <w:r>
-              <w:rPr>
-                <w:rFonts w:cs="" w:ascii="Calibri" w:hAnsi="Calibri"/>
-                <w:b w:val="false"/>
-                <w:kern w:val="0"/>
-                <w:sz w:val="21"/>
-                <w:szCs w:val="21"/>
-                <w:shd w:fill="FFFF00" w:val="clear"/>
-                <w:lang w:val="it-IT" w:eastAsia="en-US" w:bidi="ar-SA"/>
-              </w:rPr>
-              <w:t>49.62%</w:t>
-            </w:r>
-          </w:p>
-        </w:tc>
-        <w:tc>
-          <w:tcPr>
-            <w:tcW w:w="1118" w:type="dxa"/>
-            <w:tcBorders/>
-            <w:shd w:fill="F3F6FA"/>
-            <w:vAlign w:val="center"/>
-          </w:tcPr>
-          <w:p>
-            <w:pPr>
-              <w:pStyle w:val="Normal"/>
-              <w:widowControl/>
-              <w:suppressAutoHyphens w:val="true"/>
-              <w:spacing w:lineRule="auto" w:line="240" w:before="0" w:after="0"/>
-              <w:jc w:val="center"/>
-              <w:rPr/>
-            </w:pPr>
-            <w:r>
-              <w:rPr>
-                <w:rFonts w:cs="" w:ascii="Calibri" w:hAnsi="Calibri"/>
-                <w:b w:val="false"/>
-                <w:kern w:val="0"/>
-                <w:sz w:val="21"/>
-                <w:szCs w:val="21"/>
-                <w:shd w:fill="FFFF00" w:val="clear"/>
-                <w:lang w:val="it-IT" w:eastAsia="en-US" w:bidi="ar-SA"/>
-              </w:rPr>
-              <w:t>22.12%</w:t>
-            </w:r>
-          </w:p>
-        </w:tc>
-        <w:tc>
-          <w:tcPr>
-            <w:tcW w:w="1119" w:type="dxa"/>
-            <w:tcBorders/>
-            <w:shd w:fill="F3F6FA"/>
-            <w:vAlign w:val="center"/>
-          </w:tcPr>
-          <w:p>
-            <w:pPr>
-              <w:pStyle w:val="Normal"/>
-              <w:widowControl/>
-              <w:suppressAutoHyphens w:val="true"/>
-              <w:spacing w:lineRule="auto" w:line="240" w:before="0" w:after="0"/>
-              <w:jc w:val="center"/>
-              <w:rPr/>
-            </w:pPr>
-            <w:r>
-              <w:rPr>
-                <w:rFonts w:cs="" w:ascii="Calibri" w:hAnsi="Calibri"/>
-                <w:b w:val="false"/>
-                <w:kern w:val="0"/>
-                <w:sz w:val="21"/>
-                <w:szCs w:val="21"/>
-                <w:shd w:fill="FFFF00" w:val="clear"/>
-                <w:lang w:val="it-IT" w:eastAsia="en-US" w:bidi="ar-SA"/>
-              </w:rPr>
-              <w:t>17.47%</w:t>
-            </w:r>
-          </w:p>
-        </w:tc>
-        <w:tc>
-          <w:tcPr>
-            <w:tcW w:w="1120" w:type="dxa"/>
-            <w:tcBorders/>
-            <w:shd w:fill="F3F6FA"/>
-            <w:vAlign w:val="center"/>
-          </w:tcPr>
-          <w:p>
-            <w:pPr>
-              <w:pStyle w:val="Normal"/>
-              <w:widowControl/>
-              <w:suppressAutoHyphens w:val="true"/>
-              <w:spacing w:lineRule="auto" w:line="240" w:before="0" w:after="0"/>
-              <w:jc w:val="center"/>
-              <w:rPr/>
-            </w:pPr>
-            <w:r>
-              <w:rPr>
-                <w:rFonts w:cs="" w:ascii="Calibri" w:hAnsi="Calibri"/>
-                <w:b w:val="false"/>
-                <w:kern w:val="0"/>
-                <w:sz w:val="21"/>
-                <w:szCs w:val="21"/>
-                <w:shd w:fill="FFFF00" w:val="clear"/>
-                <w:lang w:val="it-IT" w:eastAsia="en-US" w:bidi="ar-SA"/>
-              </w:rPr>
-              <w:t>10.79%</w:t>
-            </w:r>
-          </w:p>
-        </w:tc>
-        <w:tc>
-          <w:tcPr>
-            <w:tcW w:w="1118" w:type="dxa"/>
-            <w:tcBorders/>
-            <w:shd w:fill="F3F6FA"/>
-            <w:vAlign w:val="center"/>
-          </w:tcPr>
-          <w:p>
-            <w:pPr>
-              <w:pStyle w:val="Normal"/>
-              <w:widowControl/>
-              <w:suppressAutoHyphens w:val="true"/>
-              <w:spacing w:lineRule="auto" w:line="240" w:before="0" w:after="0"/>
-              <w:jc w:val="center"/>
-              <w:rPr/>
-            </w:pPr>
-            <w:r>
-              <w:rPr>
-                <w:rFonts w:cs="" w:ascii="Calibri" w:hAnsi="Calibri"/>
-                <w:b w:val="false"/>
-                <w:kern w:val="0"/>
-                <w:sz w:val="21"/>
-                <w:szCs w:val="21"/>
-                <w:shd w:fill="FFFF00" w:val="clear"/>
-                <w:lang w:val="it-IT" w:eastAsia="en-US" w:bidi="ar-SA"/>
-              </w:rPr>
-              <w:t>63.30%</w:t>
-            </w:r>
-          </w:p>
-        </w:tc>
-        <w:tc>
-          <w:tcPr>
-            <w:tcW w:w="1118" w:type="dxa"/>
-            <w:tcBorders/>
-            <w:shd w:fill="F3F6FA"/>
-            <w:vAlign w:val="center"/>
-          </w:tcPr>
-          <w:p>
-            <w:pPr>
-              <w:pStyle w:val="Normal"/>
-              <w:widowControl/>
-              <w:suppressAutoHyphens w:val="true"/>
-              <w:spacing w:lineRule="auto" w:line="240" w:before="0" w:after="0"/>
-              <w:jc w:val="center"/>
-              <w:rPr/>
-            </w:pPr>
-            <w:r>
-              <w:rPr>
-                <w:rFonts w:cs="" w:ascii="Calibri" w:hAnsi="Calibri"/>
-                <w:b w:val="false"/>
-                <w:kern w:val="0"/>
-                <w:sz w:val="21"/>
-                <w:szCs w:val="21"/>
-                <w:lang w:val="it-IT" w:eastAsia="en-US" w:bidi="ar-SA"/>
-              </w:rPr>
-              <w:t>empty</w:t>
-            </w:r>
-          </w:p>
-        </w:tc>
-      </w:tr>
-      <w:tr>
-        <w:trPr/>
-        <w:tc>
-          <w:tcPr>
-            <w:tcW w:w="1118" w:type="dxa"/>
-            <w:tcBorders/>
-            <w:shd w:fill="F3F6FA"/>
-            <w:vAlign w:val="center"/>
-          </w:tcPr>
-          <w:p>
-            <w:pPr>
-              <w:pStyle w:val="Normal"/>
-              <w:widowControl/>
-              <w:suppressAutoHyphens w:val="true"/>
-              <w:spacing w:lineRule="auto" w:line="240" w:before="0" w:after="0"/>
-              <w:jc w:val="center"/>
               <w:rPr>
                 <w:rFonts w:ascii="Calibri" w:hAnsi="Calibri"/>
                 <w:sz w:val="20"/>
@@ -12727,7 +12303,7 @@
                 <w:sz w:val="20"/>
                 <w:szCs w:val="20"/>
               </w:rPr>
-              <w:t>V3 Ped-speed retune</w:t>
+              <w:t xml:space="preserve">V3 </w:t>
             </w:r>
           </w:p>
           <w:p>
@@ -12738,16 +12314,36 @@
               <w:rPr>
                 <w:rFonts w:ascii="Calibri" w:hAnsi="Calibri"/>
                 <w:b w:val="false"/>
-                <w:sz w:val="17"/>
-                <w:szCs w:val="17"/>
+                <w:sz w:val="16"/>
+                <w:szCs w:val="16"/>
               </w:rPr>
             </w:pPr>
             <w:r>
               <w:rPr>
                 <w:rFonts w:ascii="Calibri" w:hAnsi="Calibri"/>
                 <w:b w:val="false"/>
-                <w:sz w:val="17"/>
-                <w:szCs w:val="17"/>
+                <w:sz w:val="16"/>
+                <w:szCs w:val="16"/>
+              </w:rPr>
+              <w:t>Ped-speed retune</w:t>
+            </w:r>
+          </w:p>
+          <w:p>
+            <w:pPr>
+              <w:pStyle w:val="Normal"/>
+              <w:spacing w:before="0" w:after="0"/>
+              <w:jc w:val="center"/>
+              <w:rPr>
+                <w:sz w:val="16"/>
+                <w:szCs w:val="16"/>
+              </w:rPr>
+            </w:pPr>
+            <w:r>
+              <w:rPr>
+                <w:rFonts w:ascii="Calibri" w:hAnsi="Calibri"/>
+                <w:b w:val="false"/>
+                <w:sz w:val="16"/>
+                <w:szCs w:val="16"/>
                 <w:shd w:fill="FFFF00" w:val="clear"/>
               </w:rPr>
               <w:t xml:space="preserve">300K Steps </w:t>
@@ -12756,8 +12352,8 @@
               <w:rPr>
                 <w:rFonts w:ascii="Calibri" w:hAnsi="Calibri"/>
                 <w:b w:val="false"/>
-                <w:sz w:val="17"/>
-                <w:szCs w:val="17"/>
+                <w:sz w:val="16"/>
+                <w:szCs w:val="16"/>
               </w:rPr>
               <w:t xml:space="preserve">/ </w:t>
             </w:r>
@@ -12765,8 +12361,8 @@
               <w:rPr>
                 <w:rFonts w:ascii="Calibri" w:hAnsi="Calibri"/>
                 <w:b w:val="false"/>
-                <w:sz w:val="17"/>
-                <w:szCs w:val="17"/>
+                <w:sz w:val="16"/>
+                <w:szCs w:val="16"/>
                 <w:shd w:fill="FFDE59" w:val="clear"/>
               </w:rPr>
               <w:t>LvsDiff 30;60;100</w:t>
@@ -13067,7 +12663,9 @@
         <w:tc>
           <w:tcPr>
             <w:tcW w:w="1118" w:type="dxa"/>
-            <w:tcBorders/>
+            <w:tcBorders>
+              <w:top w:val="nil"/>
+            </w:tcBorders>
           </w:tcPr>
           <w:p>
             <w:pPr>
@@ -13077,16 +12675,27 @@
               <w:rPr>
                 <w:rFonts w:ascii="Calibri" w:hAnsi="Calibri"/>
                 <w:b w:val="false"/>
-                <w:sz w:val="21"/>
+                <w:sz w:val="16"/>
+                <w:szCs w:val="16"/>
               </w:rPr>
             </w:pPr>
             <w:r>
               <w:rPr>
                 <w:rFonts w:ascii="Calibri" w:hAnsi="Calibri"/>
                 <w:b w:val="false"/>
-                <w:sz w:val="21"/>
-              </w:rPr>
-              <w:t>V1 safe_to_push tolerance</w:t>
+                <w:sz w:val="20"/>
+                <w:szCs w:val="20"/>
+              </w:rPr>
+              <w:t>V1</w:t>
+            </w:r>
+            <w:r>
+              <w:rPr>
+                <w:rFonts w:ascii="Calibri" w:hAnsi="Calibri"/>
+                <w:b w:val="false"/>
+                <w:sz w:val="16"/>
+                <w:szCs w:val="16"/>
+              </w:rPr>
+              <w:t xml:space="preserve"> safe_to_push tolerance</w:t>
             </w:r>
           </w:p>
           <w:p>
@@ -13094,14 +12703,17 @@
               <w:pStyle w:val="Normal"/>
               <w:spacing w:before="0" w:after="0"/>
               <w:jc w:val="center"/>
-              <w:rPr/>
+              <w:rPr>
+                <w:sz w:val="16"/>
+                <w:szCs w:val="16"/>
+              </w:rPr>
             </w:pPr>
             <w:r>
               <w:rPr>
                 <w:rFonts w:ascii="Calibri" w:hAnsi="Calibri"/>
                 <w:b w:val="false"/>
-                <w:sz w:val="17"/>
-                <w:szCs w:val="17"/>
+                <w:sz w:val="16"/>
+                <w:szCs w:val="16"/>
                 <w:shd w:fill="FFFF00" w:val="clear"/>
               </w:rPr>
               <w:t xml:space="preserve">300K Steps </w:t>
@@ -13110,8 +12722,8 @@
               <w:rPr>
                 <w:rFonts w:ascii="Calibri" w:hAnsi="Calibri"/>
                 <w:b w:val="false"/>
-                <w:sz w:val="17"/>
-                <w:szCs w:val="17"/>
+                <w:sz w:val="16"/>
+                <w:szCs w:val="16"/>
               </w:rPr>
               <w:t xml:space="preserve">/ </w:t>
             </w:r>
@@ -13119,8 +12731,8 @@
               <w:rPr>
                 <w:rFonts w:ascii="Calibri" w:hAnsi="Calibri"/>
                 <w:b w:val="false"/>
-                <w:sz w:val="17"/>
-                <w:szCs w:val="17"/>
+                <w:sz w:val="16"/>
+                <w:szCs w:val="16"/>
                 <w:shd w:fill="FFDE59" w:val="clear"/>
               </w:rPr>
               <w:t>LvsDiff 30;60;100</w:t>
@@ -13130,7 +12742,9 @@
         <w:tc>
           <w:tcPr>
             <w:tcW w:w="1119" w:type="dxa"/>
-            <w:tcBorders/>
+            <w:tcBorders>
+              <w:top w:val="nil"/>
+            </w:tcBorders>
           </w:tcPr>
           <w:p>
             <w:pPr>
@@ -13152,7 +12766,9 @@
         <w:tc>
           <w:tcPr>
             <w:tcW w:w="1119" w:type="dxa"/>
-            <w:tcBorders/>
+            <w:tcBorders>
+              <w:top w:val="nil"/>
+            </w:tcBorders>
           </w:tcPr>
           <w:p>
             <w:pPr>
@@ -13178,7 +12794,9 @@
         <w:tc>
           <w:tcPr>
             <w:tcW w:w="1119" w:type="dxa"/>
-            <w:tcBorders/>
+            <w:tcBorders>
+              <w:top w:val="nil"/>
+            </w:tcBorders>
           </w:tcPr>
           <w:p>
             <w:pPr>
@@ -13200,7 +12818,9 @@
         <w:tc>
           <w:tcPr>
             <w:tcW w:w="1118" w:type="dxa"/>
-            <w:tcBorders/>
+            <w:tcBorders>
+              <w:top w:val="nil"/>
+            </w:tcBorders>
           </w:tcPr>
           <w:p>
             <w:pPr>
@@ -13222,7 +12842,9 @@
         <w:tc>
           <w:tcPr>
             <w:tcW w:w="1119" w:type="dxa"/>
-            <w:tcBorders/>
+            <w:tcBorders>
+              <w:top w:val="nil"/>
+            </w:tcBorders>
           </w:tcPr>
           <w:p>
             <w:pPr>
@@ -13244,7 +12866,9 @@
         <w:tc>
           <w:tcPr>
             <w:tcW w:w="1119" w:type="dxa"/>
-            <w:tcBorders/>
+            <w:tcBorders>
+              <w:top w:val="nil"/>
+            </w:tcBorders>
           </w:tcPr>
           <w:p>
             <w:pPr>
@@ -13266,7 +12890,9 @@
         <w:tc>
           <w:tcPr>
             <w:tcW w:w="1119" w:type="dxa"/>
-            <w:tcBorders/>
+            <w:tcBorders>
+              <w:top w:val="nil"/>
+            </w:tcBorders>
           </w:tcPr>
           <w:p>
             <w:pPr>
@@ -13292,7 +12918,9 @@
         <w:tc>
           <w:tcPr>
             <w:tcW w:w="1118" w:type="dxa"/>
-            <w:tcBorders/>
+            <w:tcBorders>
+              <w:top w:val="nil"/>
+            </w:tcBorders>
           </w:tcPr>
           <w:p>
             <w:pPr>
@@ -13318,7 +12946,9 @@
         <w:tc>
           <w:tcPr>
             <w:tcW w:w="1119" w:type="dxa"/>
-            <w:tcBorders/>
+            <w:tcBorders>
+              <w:top w:val="nil"/>
+            </w:tcBorders>
           </w:tcPr>
           <w:p>
             <w:pPr>
@@ -13344,7 +12974,9 @@
         <w:tc>
           <w:tcPr>
             <w:tcW w:w="1120" w:type="dxa"/>
-            <w:tcBorders/>
+            <w:tcBorders>
+              <w:top w:val="nil"/>
+            </w:tcBorders>
           </w:tcPr>
           <w:p>
             <w:pPr>
@@ -13370,7 +13002,9 @@
         <w:tc>
           <w:tcPr>
             <w:tcW w:w="1118" w:type="dxa"/>
-            <w:tcBorders/>
+            <w:tcBorders>
+              <w:top w:val="nil"/>
+            </w:tcBorders>
           </w:tcPr>
           <w:p>
             <w:pPr>
@@ -13396,22 +13030,857 @@
         <w:tc>
           <w:tcPr>
             <w:tcW w:w="1118" w:type="dxa"/>
-            <w:tcBorders/>
+            <w:tcBorders>
+              <w:top w:val="nil"/>
+            </w:tcBorders>
           </w:tcPr>
           <w:p>
             <w:pPr>
               <w:pStyle w:val="Normal"/>
               <w:spacing w:before="0" w:after="200"/>
               <w:jc w:val="center"/>
+              <w:rPr>
+                <w:rFonts w:ascii="Calibri" w:hAnsi="Calibri"/>
+                <w:b w:val="false"/>
+                <w:sz w:val="21"/>
+              </w:rPr>
+            </w:pPr>
+            <w:r>
+              <w:rPr>
+                <w:rFonts w:ascii="Calibri" w:hAnsi="Calibri"/>
+                <w:b w:val="false"/>
+                <w:sz w:val="21"/>
+              </w:rPr>
+              <w:t>empty</w:t>
+            </w:r>
+          </w:p>
+        </w:tc>
+      </w:tr>
+      <w:tr>
+        <w:trPr/>
+        <w:tc>
+          <w:tcPr>
+            <w:tcW w:w="1118" w:type="dxa"/>
+            <w:tcBorders>
+              <w:top w:val="nil"/>
+            </w:tcBorders>
+          </w:tcPr>
+          <w:p>
+            <w:pPr>
+              <w:pStyle w:val="Normal"/>
+              <w:widowControl/>
+              <w:suppressAutoHyphens w:val="true"/>
+              <w:spacing w:lineRule="auto" w:line="240" w:before="0" w:after="0"/>
+              <w:jc w:val="center"/>
               <w:rPr/>
             </w:pPr>
             <w:r>
               <w:rPr>
+                <w:rFonts w:cs="" w:ascii="Calibri" w:hAnsi="Calibri"/>
+                <w:b w:val="false"/>
+                <w:kern w:val="0"/>
+                <w:sz w:val="20"/>
+                <w:szCs w:val="20"/>
+                <w:lang w:val="it-IT" w:eastAsia="en-US" w:bidi="ar-SA"/>
+              </w:rPr>
+              <w:t xml:space="preserve">Full curr. / </w:t>
+            </w:r>
+            <w:r>
+              <w:rPr>
+                <w:rFonts w:cs="" w:ascii="Calibri" w:hAnsi="Calibri"/>
+                <w:b w:val="false"/>
+                <w:kern w:val="0"/>
+                <w:sz w:val="20"/>
+                <w:szCs w:val="20"/>
+                <w:shd w:fill="BF819E" w:val="clear"/>
+                <w:lang w:val="it-IT" w:eastAsia="en-US" w:bidi="ar-SA"/>
+              </w:rPr>
+              <w:t xml:space="preserve">3M Steps </w:t>
+            </w:r>
+            <w:r>
+              <w:rPr>
+                <w:rFonts w:cs="" w:ascii="Calibri" w:hAnsi="Calibri"/>
+                <w:b w:val="false"/>
+                <w:kern w:val="0"/>
+                <w:sz w:val="20"/>
+                <w:szCs w:val="20"/>
+                <w:shd w:fill="BF819E" w:val="clear"/>
+                <w:lang w:val="it-IT" w:eastAsia="en-US" w:bidi="ar-SA"/>
+              </w:rPr>
+              <w:t>/</w:t>
+            </w:r>
+            <w:r>
+              <w:rPr>
+                <w:rFonts w:cs="" w:ascii="Calibri" w:hAnsi="Calibri"/>
+                <w:b w:val="false"/>
+                <w:kern w:val="0"/>
+                <w:sz w:val="20"/>
+                <w:szCs w:val="20"/>
+                <w:lang w:val="it-IT" w:eastAsia="en-US" w:bidi="ar-SA"/>
+              </w:rPr>
+              <w:t xml:space="preserve"> </w:t>
+            </w:r>
+            <w:r>
+              <w:rPr>
+                <w:rFonts w:cs="" w:ascii="Calibri" w:hAnsi="Calibri"/>
+                <w:b w:val="false"/>
+                <w:kern w:val="0"/>
+                <w:sz w:val="20"/>
+                <w:szCs w:val="20"/>
+                <w:shd w:fill="FFDE59" w:val="clear"/>
+                <w:lang w:val="it-IT" w:eastAsia="en-US" w:bidi="ar-SA"/>
+              </w:rPr>
+              <w:t>LvsDiff 30;60;100</w:t>
+            </w:r>
+          </w:p>
+        </w:tc>
+        <w:tc>
+          <w:tcPr>
+            <w:tcW w:w="1119" w:type="dxa"/>
+            <w:tcBorders>
+              <w:top w:val="nil"/>
+            </w:tcBorders>
+          </w:tcPr>
+          <w:p>
+            <w:pPr>
+              <w:pStyle w:val="Normal"/>
+              <w:widowControl/>
+              <w:suppressAutoHyphens w:val="true"/>
+              <w:spacing w:lineRule="auto" w:line="240" w:before="0" w:after="0"/>
+              <w:jc w:val="center"/>
+              <w:rPr/>
+            </w:pPr>
+            <w:r>
+              <w:rPr>
+                <w:rFonts w:cs="" w:ascii="Calibri" w:hAnsi="Calibri"/>
+                <w:b w:val="false"/>
+                <w:kern w:val="0"/>
+                <w:sz w:val="21"/>
+                <w:szCs w:val="21"/>
+                <w:lang w:val="it-IT" w:eastAsia="en-US" w:bidi="ar-SA"/>
+              </w:rPr>
+              <w:t>carla_mappo_20260519_001217</w:t>
+            </w:r>
+          </w:p>
+        </w:tc>
+        <w:tc>
+          <w:tcPr>
+            <w:tcW w:w="1119" w:type="dxa"/>
+            <w:tcBorders>
+              <w:top w:val="nil"/>
+            </w:tcBorders>
+          </w:tcPr>
+          <w:p>
+            <w:pPr>
+              <w:pStyle w:val="Normal"/>
+              <w:widowControl/>
+              <w:suppressAutoHyphens w:val="true"/>
+              <w:spacing w:lineRule="auto" w:line="240" w:before="0" w:after="0"/>
+              <w:jc w:val="center"/>
+              <w:rPr>
+                <w:highlight w:val="none"/>
+                <w:shd w:fill="auto" w:val="clear"/>
+              </w:rPr>
+            </w:pPr>
+            <w:r>
+              <w:rPr>
+                <w:rFonts w:cs="" w:ascii="Calibri" w:hAnsi="Calibri"/>
+                <w:b w:val="false"/>
+                <w:kern w:val="0"/>
+                <w:sz w:val="21"/>
+                <w:szCs w:val="21"/>
+                <w:shd w:fill="auto" w:val="clear"/>
+                <w:lang w:val="it-IT" w:eastAsia="en-US" w:bidi="ar-SA"/>
+              </w:rPr>
+              <w:t>training OK</w:t>
+            </w:r>
+          </w:p>
+        </w:tc>
+        <w:tc>
+          <w:tcPr>
+            <w:tcW w:w="1119" w:type="dxa"/>
+            <w:tcBorders>
+              <w:top w:val="nil"/>
+            </w:tcBorders>
+          </w:tcPr>
+          <w:p>
+            <w:pPr>
+              <w:pStyle w:val="Normal"/>
+              <w:widowControl/>
+              <w:suppressAutoHyphens w:val="true"/>
+              <w:spacing w:lineRule="auto" w:line="240" w:before="0" w:after="0"/>
+              <w:jc w:val="center"/>
+              <w:rPr/>
+            </w:pPr>
+            <w:r>
+              <w:rPr>
+                <w:rFonts w:cs="" w:ascii="Calibri" w:hAnsi="Calibri"/>
+                <w:b w:val="false"/>
+                <w:kern w:val="0"/>
+                <w:sz w:val="21"/>
+                <w:szCs w:val="21"/>
+                <w:lang w:val="it-IT" w:eastAsia="en-US" w:bidi="ar-SA"/>
+              </w:rPr>
+              <w:t>3393</w:t>
+            </w:r>
+          </w:p>
+        </w:tc>
+        <w:tc>
+          <w:tcPr>
+            <w:tcW w:w="1118" w:type="dxa"/>
+            <w:tcBorders>
+              <w:top w:val="nil"/>
+            </w:tcBorders>
+          </w:tcPr>
+          <w:p>
+            <w:pPr>
+              <w:pStyle w:val="Normal"/>
+              <w:widowControl/>
+              <w:suppressAutoHyphens w:val="true"/>
+              <w:spacing w:lineRule="auto" w:line="240" w:before="0" w:after="0"/>
+              <w:jc w:val="center"/>
+              <w:rPr/>
+            </w:pPr>
+            <w:r>
+              <w:rPr>
+                <w:rFonts w:cs="" w:ascii="Calibri" w:hAnsi="Calibri"/>
+                <w:b w:val="false"/>
+                <w:kern w:val="0"/>
+                <w:sz w:val="21"/>
+                <w:szCs w:val="21"/>
+                <w:lang w:val="it-IT" w:eastAsia="en-US" w:bidi="ar-SA"/>
+              </w:rPr>
+              <w:t>20358</w:t>
+            </w:r>
+          </w:p>
+        </w:tc>
+        <w:tc>
+          <w:tcPr>
+            <w:tcW w:w="1119" w:type="dxa"/>
+            <w:tcBorders>
+              <w:top w:val="nil"/>
+            </w:tcBorders>
+          </w:tcPr>
+          <w:p>
+            <w:pPr>
+              <w:pStyle w:val="Normal"/>
+              <w:widowControl/>
+              <w:suppressAutoHyphens w:val="true"/>
+              <w:spacing w:lineRule="auto" w:line="240" w:before="0" w:after="0"/>
+              <w:jc w:val="center"/>
+              <w:rPr/>
+            </w:pPr>
+            <w:r>
+              <w:rPr>
+                <w:rFonts w:cs="" w:ascii="Calibri" w:hAnsi="Calibri"/>
+                <w:b w:val="false"/>
+                <w:kern w:val="0"/>
+                <w:sz w:val="21"/>
+                <w:szCs w:val="21"/>
+                <w:lang w:val="it-IT" w:eastAsia="en-US" w:bidi="ar-SA"/>
+              </w:rPr>
+              <w:t>225</w:t>
+            </w:r>
+          </w:p>
+        </w:tc>
+        <w:tc>
+          <w:tcPr>
+            <w:tcW w:w="1119" w:type="dxa"/>
+            <w:tcBorders>
+              <w:top w:val="nil"/>
+            </w:tcBorders>
+          </w:tcPr>
+          <w:p>
+            <w:pPr>
+              <w:pStyle w:val="Normal"/>
+              <w:widowControl/>
+              <w:suppressAutoHyphens w:val="true"/>
+              <w:spacing w:lineRule="auto" w:line="240" w:before="0" w:after="0"/>
+              <w:jc w:val="center"/>
+              <w:rPr/>
+            </w:pPr>
+            <w:r>
+              <w:rPr>
+                <w:rFonts w:cs="" w:ascii="Calibri" w:hAnsi="Calibri"/>
+                <w:b w:val="false"/>
+                <w:kern w:val="0"/>
+                <w:sz w:val="21"/>
+                <w:szCs w:val="21"/>
+                <w:lang w:val="it-IT" w:eastAsia="en-US" w:bidi="ar-SA"/>
+              </w:rPr>
+              <w:t>3005318</w:t>
+            </w:r>
+          </w:p>
+        </w:tc>
+        <w:tc>
+          <w:tcPr>
+            <w:tcW w:w="1119" w:type="dxa"/>
+            <w:tcBorders>
+              <w:top w:val="nil"/>
+            </w:tcBorders>
+          </w:tcPr>
+          <w:p>
+            <w:pPr>
+              <w:pStyle w:val="Normal"/>
+              <w:widowControl/>
+              <w:suppressAutoHyphens w:val="true"/>
+              <w:spacing w:lineRule="auto" w:line="240" w:before="0" w:after="0"/>
+              <w:jc w:val="center"/>
+              <w:rPr/>
+            </w:pPr>
+            <w:r>
+              <w:rPr>
+                <w:rFonts w:cs="" w:ascii="Calibri" w:hAnsi="Calibri"/>
+                <w:b w:val="false"/>
+                <w:kern w:val="0"/>
+                <w:sz w:val="21"/>
+                <w:szCs w:val="21"/>
+                <w:shd w:fill="FFFF00" w:val="clear"/>
+                <w:lang w:val="it-IT" w:eastAsia="en-US" w:bidi="ar-SA"/>
+              </w:rPr>
+              <w:t>49.62%</w:t>
+            </w:r>
+          </w:p>
+        </w:tc>
+        <w:tc>
+          <w:tcPr>
+            <w:tcW w:w="1118" w:type="dxa"/>
+            <w:tcBorders>
+              <w:top w:val="nil"/>
+            </w:tcBorders>
+          </w:tcPr>
+          <w:p>
+            <w:pPr>
+              <w:pStyle w:val="Normal"/>
+              <w:widowControl/>
+              <w:suppressAutoHyphens w:val="true"/>
+              <w:spacing w:lineRule="auto" w:line="240" w:before="0" w:after="0"/>
+              <w:jc w:val="center"/>
+              <w:rPr/>
+            </w:pPr>
+            <w:r>
+              <w:rPr>
+                <w:rFonts w:cs="" w:ascii="Calibri" w:hAnsi="Calibri"/>
+                <w:b w:val="false"/>
+                <w:kern w:val="0"/>
+                <w:sz w:val="21"/>
+                <w:szCs w:val="21"/>
+                <w:shd w:fill="FFFF00" w:val="clear"/>
+                <w:lang w:val="it-IT" w:eastAsia="en-US" w:bidi="ar-SA"/>
+              </w:rPr>
+              <w:t>22.12%</w:t>
+            </w:r>
+          </w:p>
+        </w:tc>
+        <w:tc>
+          <w:tcPr>
+            <w:tcW w:w="1119" w:type="dxa"/>
+            <w:tcBorders>
+              <w:top w:val="nil"/>
+            </w:tcBorders>
+          </w:tcPr>
+          <w:p>
+            <w:pPr>
+              <w:pStyle w:val="Normal"/>
+              <w:widowControl/>
+              <w:suppressAutoHyphens w:val="true"/>
+              <w:spacing w:lineRule="auto" w:line="240" w:before="0" w:after="0"/>
+              <w:jc w:val="center"/>
+              <w:rPr/>
+            </w:pPr>
+            <w:r>
+              <w:rPr>
+                <w:rFonts w:cs="" w:ascii="Calibri" w:hAnsi="Calibri"/>
+                <w:b w:val="false"/>
+                <w:kern w:val="0"/>
+                <w:sz w:val="21"/>
+                <w:szCs w:val="21"/>
+                <w:shd w:fill="FFFF00" w:val="clear"/>
+                <w:lang w:val="it-IT" w:eastAsia="en-US" w:bidi="ar-SA"/>
+              </w:rPr>
+              <w:t>17.47%</w:t>
+            </w:r>
+          </w:p>
+        </w:tc>
+        <w:tc>
+          <w:tcPr>
+            <w:tcW w:w="1120" w:type="dxa"/>
+            <w:tcBorders>
+              <w:top w:val="nil"/>
+            </w:tcBorders>
+          </w:tcPr>
+          <w:p>
+            <w:pPr>
+              <w:pStyle w:val="Normal"/>
+              <w:widowControl/>
+              <w:suppressAutoHyphens w:val="true"/>
+              <w:spacing w:lineRule="auto" w:line="240" w:before="0" w:after="0"/>
+              <w:jc w:val="center"/>
+              <w:rPr/>
+            </w:pPr>
+            <w:r>
+              <w:rPr>
+                <w:rFonts w:cs="" w:ascii="Calibri" w:hAnsi="Calibri"/>
+                <w:b w:val="false"/>
+                <w:kern w:val="0"/>
+                <w:sz w:val="21"/>
+                <w:szCs w:val="21"/>
+                <w:shd w:fill="FFFF00" w:val="clear"/>
+                <w:lang w:val="it-IT" w:eastAsia="en-US" w:bidi="ar-SA"/>
+              </w:rPr>
+              <w:t>10.79%</w:t>
+            </w:r>
+          </w:p>
+        </w:tc>
+        <w:tc>
+          <w:tcPr>
+            <w:tcW w:w="1118" w:type="dxa"/>
+            <w:tcBorders>
+              <w:top w:val="nil"/>
+            </w:tcBorders>
+          </w:tcPr>
+          <w:p>
+            <w:pPr>
+              <w:pStyle w:val="Normal"/>
+              <w:widowControl/>
+              <w:suppressAutoHyphens w:val="true"/>
+              <w:spacing w:lineRule="auto" w:line="240" w:before="0" w:after="0"/>
+              <w:jc w:val="center"/>
+              <w:rPr/>
+            </w:pPr>
+            <w:r>
+              <w:rPr>
+                <w:rFonts w:cs="" w:ascii="Calibri" w:hAnsi="Calibri"/>
+                <w:b w:val="false"/>
+                <w:kern w:val="0"/>
+                <w:sz w:val="21"/>
+                <w:szCs w:val="21"/>
+                <w:shd w:fill="FFFF00" w:val="clear"/>
+                <w:lang w:val="it-IT" w:eastAsia="en-US" w:bidi="ar-SA"/>
+              </w:rPr>
+              <w:t>63.30%</w:t>
+            </w:r>
+          </w:p>
+        </w:tc>
+        <w:tc>
+          <w:tcPr>
+            <w:tcW w:w="1118" w:type="dxa"/>
+            <w:tcBorders>
+              <w:top w:val="nil"/>
+            </w:tcBorders>
+          </w:tcPr>
+          <w:p>
+            <w:pPr>
+              <w:pStyle w:val="Normal"/>
+              <w:widowControl/>
+              <w:suppressAutoHyphens w:val="true"/>
+              <w:spacing w:lineRule="auto" w:line="240" w:before="0" w:after="0"/>
+              <w:jc w:val="center"/>
+              <w:rPr/>
+            </w:pPr>
+            <w:r>
+              <w:rPr>
+                <w:rFonts w:cs="" w:ascii="Calibri" w:hAnsi="Calibri"/>
+                <w:b w:val="false"/>
+                <w:kern w:val="0"/>
+                <w:sz w:val="21"/>
+                <w:szCs w:val="21"/>
+                <w:lang w:val="it-IT" w:eastAsia="en-US" w:bidi="ar-SA"/>
+              </w:rPr>
+              <w:t>empty</w:t>
+            </w:r>
+          </w:p>
+        </w:tc>
+      </w:tr>
+      <w:tr>
+        <w:trPr/>
+        <w:tc>
+          <w:tcPr>
+            <w:tcW w:w="1118" w:type="dxa"/>
+            <w:tcBorders/>
+          </w:tcPr>
+          <w:p>
+            <w:pPr>
+              <w:pStyle w:val="Normal"/>
+              <w:spacing w:before="0" w:after="200"/>
+              <w:jc w:val="center"/>
+              <w:rPr>
                 <w:rFonts w:ascii="Calibri" w:hAnsi="Calibri"/>
-                <w:b w:val="false"/>
-                <w:sz w:val="21"/>
-              </w:rPr>
-              <w:t>empty</w:t>
+                <w:sz w:val="21"/>
+                <w:szCs w:val="21"/>
+              </w:rPr>
+            </w:pPr>
+            <w:r>
+              <w:rPr>
+                <w:rFonts w:ascii="Calibri" w:hAnsi="Calibri"/>
+                <w:sz w:val="21"/>
+                <w:szCs w:val="21"/>
+              </w:rPr>
+              <w:t xml:space="preserve">Full curr. </w:t>
+            </w:r>
+            <w:r>
+              <w:rPr>
+                <w:rFonts w:ascii="Calibri" w:hAnsi="Calibri"/>
+                <w:sz w:val="20"/>
+                <w:szCs w:val="20"/>
+              </w:rPr>
+              <w:t xml:space="preserve">V1+P1+P2+P3/ </w:t>
+            </w:r>
+            <w:r>
+              <w:rPr>
+                <w:rFonts w:ascii="Calibri" w:hAnsi="Calibri"/>
+                <w:sz w:val="20"/>
+                <w:szCs w:val="20"/>
+                <w:shd w:fill="BF819E" w:val="clear"/>
+              </w:rPr>
+              <w:t>3M Steps/</w:t>
+            </w:r>
+            <w:r>
+              <w:rPr>
+                <w:rFonts w:ascii="Calibri" w:hAnsi="Calibri"/>
+                <w:sz w:val="20"/>
+                <w:szCs w:val="20"/>
+              </w:rPr>
+              <w:t xml:space="preserve"> </w:t>
+            </w:r>
+            <w:r>
+              <w:rPr>
+                <w:rFonts w:ascii="Calibri" w:hAnsi="Calibri"/>
+                <w:sz w:val="20"/>
+                <w:szCs w:val="20"/>
+                <w:shd w:fill="FFBF00" w:val="clear"/>
+              </w:rPr>
+              <w:t>LvsDiff 30;60;100</w:t>
+            </w:r>
+          </w:p>
+        </w:tc>
+        <w:tc>
+          <w:tcPr>
+            <w:tcW w:w="1119" w:type="dxa"/>
+            <w:tcBorders/>
+          </w:tcPr>
+          <w:p>
+            <w:pPr>
+              <w:pStyle w:val="Normal"/>
+              <w:spacing w:before="0" w:after="200"/>
+              <w:jc w:val="center"/>
+              <w:rPr>
+                <w:rFonts w:ascii="Calibri" w:hAnsi="Calibri"/>
+                <w:sz w:val="21"/>
+                <w:szCs w:val="21"/>
+              </w:rPr>
+            </w:pPr>
+            <w:r>
+              <w:rPr>
+                <w:rFonts w:ascii="Calibri" w:hAnsi="Calibri"/>
+                <w:sz w:val="21"/>
+                <w:szCs w:val="21"/>
+              </w:rPr>
+              <w:t>carla_mappo_20260525_205912</w:t>
+            </w:r>
+          </w:p>
+        </w:tc>
+        <w:tc>
+          <w:tcPr>
+            <w:tcW w:w="1119" w:type="dxa"/>
+            <w:tcBorders/>
+          </w:tcPr>
+          <w:p>
+            <w:pPr>
+              <w:pStyle w:val="Normal"/>
+              <w:spacing w:before="0" w:after="200"/>
+              <w:jc w:val="center"/>
+              <w:rPr>
+                <w:rFonts w:ascii="Calibri" w:hAnsi="Calibri"/>
+                <w:sz w:val="21"/>
+                <w:szCs w:val="21"/>
+              </w:rPr>
+            </w:pPr>
+            <w:r>
+              <w:rPr>
+                <w:rFonts w:ascii="Calibri" w:hAnsi="Calibri"/>
+                <w:sz w:val="21"/>
+                <w:szCs w:val="21"/>
+              </w:rPr>
+              <w:t>baseline curriculum-stack</w:t>
+            </w:r>
+          </w:p>
+        </w:tc>
+        <w:tc>
+          <w:tcPr>
+            <w:tcW w:w="1119" w:type="dxa"/>
+            <w:tcBorders/>
+          </w:tcPr>
+          <w:p>
+            <w:pPr>
+              <w:pStyle w:val="Normal"/>
+              <w:spacing w:before="0" w:after="200"/>
+              <w:jc w:val="center"/>
+              <w:rPr>
+                <w:rFonts w:ascii="Calibri" w:hAnsi="Calibri"/>
+                <w:sz w:val="21"/>
+                <w:szCs w:val="21"/>
+              </w:rPr>
+            </w:pPr>
+            <w:r>
+              <w:rPr>
+                <w:rFonts w:ascii="Calibri" w:hAnsi="Calibri"/>
+                <w:sz w:val="21"/>
+                <w:szCs w:val="21"/>
+              </w:rPr>
+              <w:t>3318</w:t>
+            </w:r>
+          </w:p>
+        </w:tc>
+        <w:tc>
+          <w:tcPr>
+            <w:tcW w:w="1118" w:type="dxa"/>
+            <w:tcBorders/>
+          </w:tcPr>
+          <w:p>
+            <w:pPr>
+              <w:pStyle w:val="Normal"/>
+              <w:spacing w:before="0" w:after="200"/>
+              <w:jc w:val="center"/>
+              <w:rPr>
+                <w:rFonts w:ascii="Calibri" w:hAnsi="Calibri"/>
+                <w:sz w:val="21"/>
+                <w:szCs w:val="21"/>
+              </w:rPr>
+            </w:pPr>
+            <w:r>
+              <w:rPr>
+                <w:rFonts w:ascii="Calibri" w:hAnsi="Calibri"/>
+                <w:sz w:val="21"/>
+                <w:szCs w:val="21"/>
+              </w:rPr>
+              <w:t>19908</w:t>
+            </w:r>
+          </w:p>
+        </w:tc>
+        <w:tc>
+          <w:tcPr>
+            <w:tcW w:w="1119" w:type="dxa"/>
+            <w:tcBorders/>
+          </w:tcPr>
+          <w:p>
+            <w:pPr>
+              <w:pStyle w:val="Normal"/>
+              <w:spacing w:before="0" w:after="200"/>
+              <w:jc w:val="center"/>
+              <w:rPr>
+                <w:rFonts w:ascii="Calibri" w:hAnsi="Calibri"/>
+                <w:sz w:val="21"/>
+                <w:szCs w:val="21"/>
+              </w:rPr>
+            </w:pPr>
+            <w:r>
+              <w:rPr>
+                <w:rFonts w:ascii="Calibri" w:hAnsi="Calibri"/>
+                <w:sz w:val="21"/>
+                <w:szCs w:val="21"/>
+              </w:rPr>
+              <w:t>225</w:t>
+            </w:r>
+          </w:p>
+        </w:tc>
+        <w:tc>
+          <w:tcPr>
+            <w:tcW w:w="1119" w:type="dxa"/>
+            <w:tcBorders/>
+          </w:tcPr>
+          <w:p>
+            <w:pPr>
+              <w:pStyle w:val="Normal"/>
+              <w:spacing w:before="0" w:after="200"/>
+              <w:jc w:val="center"/>
+              <w:rPr>
+                <w:rFonts w:ascii="Calibri" w:hAnsi="Calibri"/>
+                <w:sz w:val="21"/>
+                <w:szCs w:val="21"/>
+              </w:rPr>
+            </w:pPr>
+            <w:r>
+              <w:rPr>
+                <w:rFonts w:ascii="Calibri" w:hAnsi="Calibri"/>
+                <w:sz w:val="21"/>
+                <w:szCs w:val="21"/>
+              </w:rPr>
+              <w:t>3006141</w:t>
+            </w:r>
+          </w:p>
+        </w:tc>
+        <w:tc>
+          <w:tcPr>
+            <w:tcW w:w="1119" w:type="dxa"/>
+            <w:tcBorders/>
+          </w:tcPr>
+          <w:p>
+            <w:pPr>
+              <w:pStyle w:val="Normal"/>
+              <w:spacing w:before="0" w:after="200"/>
+              <w:jc w:val="center"/>
+              <w:rPr>
+                <w:rFonts w:ascii="Calibri" w:hAnsi="Calibri"/>
+                <w:sz w:val="21"/>
+                <w:szCs w:val="21"/>
+                <w:highlight w:val="none"/>
+                <w:shd w:fill="81D41A" w:val="clear"/>
+              </w:rPr>
+            </w:pPr>
+            <w:r>
+              <w:rPr>
+                <w:rFonts w:ascii="Calibri" w:hAnsi="Calibri"/>
+                <w:sz w:val="21"/>
+                <w:szCs w:val="21"/>
+                <w:shd w:fill="81D41A" w:val="clear"/>
+              </w:rPr>
+              <w:t>55.16%</w:t>
+            </w:r>
+          </w:p>
+        </w:tc>
+        <w:tc>
+          <w:tcPr>
+            <w:tcW w:w="1118" w:type="dxa"/>
+            <w:tcBorders/>
+          </w:tcPr>
+          <w:p>
+            <w:pPr>
+              <w:pStyle w:val="Normal"/>
+              <w:spacing w:before="0" w:after="200"/>
+              <w:jc w:val="center"/>
+              <w:rPr>
+                <w:rFonts w:ascii="Calibri" w:hAnsi="Calibri"/>
+                <w:sz w:val="21"/>
+                <w:szCs w:val="21"/>
+                <w:highlight w:val="none"/>
+                <w:shd w:fill="FFFF00" w:val="clear"/>
+              </w:rPr>
+            </w:pPr>
+            <w:r>
+              <w:rPr>
+                <w:rFonts w:ascii="Calibri" w:hAnsi="Calibri"/>
+                <w:sz w:val="21"/>
+                <w:szCs w:val="21"/>
+                <w:shd w:fill="FFFF00" w:val="clear"/>
+              </w:rPr>
+              <w:t>24.77%</w:t>
+            </w:r>
+          </w:p>
+        </w:tc>
+        <w:tc>
+          <w:tcPr>
+            <w:tcW w:w="1119" w:type="dxa"/>
+            <w:tcBorders/>
+          </w:tcPr>
+          <w:p>
+            <w:pPr>
+              <w:pStyle w:val="Normal"/>
+              <w:spacing w:before="0" w:after="200"/>
+              <w:jc w:val="center"/>
+              <w:rPr>
+                <w:rFonts w:ascii="Calibri" w:hAnsi="Calibri"/>
+                <w:sz w:val="21"/>
+                <w:szCs w:val="21"/>
+                <w:highlight w:val="none"/>
+                <w:shd w:fill="81D41A" w:val="clear"/>
+              </w:rPr>
+            </w:pPr>
+            <w:r>
+              <w:rPr>
+                <w:rFonts w:ascii="Calibri" w:hAnsi="Calibri"/>
+                <w:sz w:val="21"/>
+                <w:szCs w:val="21"/>
+                <w:shd w:fill="81D41A" w:val="clear"/>
+              </w:rPr>
+              <w:t>13.45%</w:t>
+            </w:r>
+          </w:p>
+        </w:tc>
+        <w:tc>
+          <w:tcPr>
+            <w:tcW w:w="1120" w:type="dxa"/>
+            <w:tcBorders/>
+          </w:tcPr>
+          <w:p>
+            <w:pPr>
+              <w:pStyle w:val="Normal"/>
+              <w:spacing w:before="0" w:after="200"/>
+              <w:jc w:val="center"/>
+              <w:rPr>
+                <w:rFonts w:ascii="Calibri" w:hAnsi="Calibri"/>
+                <w:sz w:val="21"/>
+                <w:szCs w:val="21"/>
+                <w:highlight w:val="none"/>
+                <w:shd w:fill="81D41A" w:val="clear"/>
+              </w:rPr>
+            </w:pPr>
+            <w:r>
+              <w:rPr>
+                <w:rFonts w:ascii="Calibri" w:hAnsi="Calibri"/>
+                <w:sz w:val="21"/>
+                <w:szCs w:val="21"/>
+                <w:shd w:fill="81D41A" w:val="clear"/>
+              </w:rPr>
+              <w:t>6.61%</w:t>
+            </w:r>
+          </w:p>
+        </w:tc>
+        <w:tc>
+          <w:tcPr>
+            <w:tcW w:w="1118" w:type="dxa"/>
+            <w:tcBorders/>
+          </w:tcPr>
+          <w:p>
+            <w:pPr>
+              <w:pStyle w:val="Normal"/>
+              <w:spacing w:before="0" w:after="200"/>
+              <w:jc w:val="center"/>
+              <w:rPr>
+                <w:rFonts w:ascii="Calibri" w:hAnsi="Calibri"/>
+                <w:sz w:val="21"/>
+                <w:szCs w:val="21"/>
+                <w:highlight w:val="none"/>
+                <w:shd w:fill="FFFF00" w:val="clear"/>
+              </w:rPr>
+            </w:pPr>
+            <w:r>
+              <w:rPr>
+                <w:rFonts w:ascii="Calibri" w:hAnsi="Calibri"/>
+                <w:sz w:val="21"/>
+                <w:szCs w:val="21"/>
+                <w:shd w:fill="FFFF00" w:val="clear"/>
+              </w:rPr>
+              <w:t>40.24%</w:t>
+            </w:r>
+          </w:p>
+        </w:tc>
+        <w:tc>
+          <w:tcPr>
+            <w:tcW w:w="1118" w:type="dxa"/>
+            <w:tcBorders/>
+          </w:tcPr>
+          <w:p>
+            <w:pPr>
+              <w:pStyle w:val="Normal"/>
+              <w:spacing w:before="0" w:after="200"/>
+              <w:jc w:val="center"/>
+              <w:rPr>
+                <w:rFonts w:ascii="Calibri" w:hAnsi="Calibri"/>
+                <w:sz w:val="21"/>
+                <w:szCs w:val="21"/>
+                <w:highlight w:val="none"/>
+                <w:shd w:fill="FFFF00" w:val="clear"/>
+              </w:rPr>
+            </w:pPr>
+            <w:r>
+              <w:rPr>
+                <w:rFonts w:ascii="Calibri" w:hAnsi="Calibri"/>
+                <w:sz w:val="21"/>
+                <w:szCs w:val="21"/>
+                <w:shd w:fill="FFFF00" w:val="clear"/>
+              </w:rPr>
+              <w:t>Ped SR corr Block-5.1; raw 62.13%</w:t>
             </w:r>
           </w:p>
         </w:tc>
@@ -20710,15 +21179,15 @@
       <w:rFonts w:cs="Lucida Sans"/>
     </w:rPr>
   </w:style>
-  <w:style w:type="paragraph" w:styleId="Intestazioneepidipagina">
-    <w:name w:val="Intestazione e piè di pagina"/>
+  <w:style w:type="paragraph" w:styleId="Intestazioneepidipaginauser">
+    <w:name w:val="Intestazione e piè di pagina (user)"/>
     <w:basedOn w:val="Normal"/>
     <w:qFormat/>
     <w:pPr/>
     <w:rPr/>
   </w:style>
-  <w:style w:type="paragraph" w:styleId="Intestazioneepidipaginauser">
-    <w:name w:val="Intestazione e piè di pagina (user)"/>
+  <w:style w:type="paragraph" w:styleId="Intestazioneepidipagina">
+    <w:name w:val="Intestazione e piè di pagina"/>
     <w:basedOn w:val="Normal"/>
     <w:qFormat/>
     <w:pPr/>
@@ -21100,7 +21569,7 @@
   </w:style>
   <w:style w:type="paragraph" w:styleId="IndexHeading">
     <w:name w:val="index heading"/>
-    <w:basedOn w:val="Titolo"/>
+    <w:basedOn w:val="Titolouser"/>
     <w:pPr/>
     <w:rPr/>
   </w:style>
@@ -21117,6 +21586,29 @@
       <w:outlineLvl w:val="9"/>
     </w:pPr>
     <w:rPr/>
+  </w:style>
+  <w:style w:type="paragraph" w:styleId="Contenutotabellauser">
+    <w:name w:val="Contenuto tabella (user)"/>
+    <w:basedOn w:val="Normal"/>
+    <w:qFormat/>
+    <w:pPr>
+      <w:widowControl w:val="false"/>
+      <w:suppressLineNumbers/>
+    </w:pPr>
+    <w:rPr/>
+  </w:style>
+  <w:style w:type="paragraph" w:styleId="Titolotabellauser">
+    <w:name w:val="Titolo tabella (user)"/>
+    <w:basedOn w:val="Contenutotabellauser"/>
+    <w:qFormat/>
+    <w:pPr>
+      <w:suppressLineNumbers/>
+      <w:jc w:val="center"/>
+    </w:pPr>
+    <w:rPr>
+      <w:b/>
+      <w:bCs/>
+    </w:rPr>
   </w:style>
   <w:style w:type="paragraph" w:styleId="Contenutotabella">
     <w:name w:val="Contenuto tabella"/>
@@ -21141,8 +21633,8 @@
       <w:bCs/>
     </w:rPr>
   </w:style>
-  <w:style w:type="numbering" w:styleId="Nessunelenco" w:default="1">
-    <w:name w:val="Nessun elenco"/>
+  <w:style w:type="numbering" w:styleId="Nessunelencouser" w:default="1">
+    <w:name w:val="Nessun elenco (user)"/>
     <w:uiPriority w:val="99"/>
     <w:semiHidden/>
     <w:unhideWhenUsed/>

</xml_diff>

<commit_message>
UpdatePlan&Context - Create test script for check path pedoni
</commit_message>
<xml_diff>
--- a/reports/carla_finetuning_maggio_2026.docx
+++ b/reports/carla_finetuning_maggio_2026.docx
@@ -13885,6 +13885,138 @@
           </w:p>
         </w:tc>
       </w:tr>
+      <w:tr>
+        <w:tc>
+          <w:tcPr>
+            <w:tcW w:type="dxa" w:w="1118"/>
+          </w:tcPr>
+          <w:p>
+            <w:r>
+              <w:t>Conferma post-revert 23a0342 / 3M Steps / LvsDiff 30;60;100</w:t>
+            </w:r>
+          </w:p>
+        </w:tc>
+        <w:tc>
+          <w:tcPr>
+            <w:tcW w:type="dxa" w:w="1119"/>
+          </w:tcPr>
+          <w:p>
+            <w:r>
+              <w:t>carla_mappo_20260610_192146</w:t>
+            </w:r>
+          </w:p>
+        </w:tc>
+        <w:tc>
+          <w:tcPr>
+            <w:tcW w:type="dxa" w:w="1119"/>
+          </w:tcPr>
+          <w:p>
+            <w:r>
+              <w:t>conferma sana / PASS (regressione r0529 non riprodotta)</w:t>
+            </w:r>
+          </w:p>
+        </w:tc>
+        <w:tc>
+          <w:tcPr>
+            <w:tcW w:type="dxa" w:w="1119"/>
+          </w:tcPr>
+          <w:p>
+            <w:r>
+              <w:t>3297</w:t>
+            </w:r>
+          </w:p>
+        </w:tc>
+        <w:tc>
+          <w:tcPr>
+            <w:tcW w:type="dxa" w:w="1118"/>
+          </w:tcPr>
+          <w:p>
+            <w:r>
+              <w:t>19782</w:t>
+            </w:r>
+          </w:p>
+        </w:tc>
+        <w:tc>
+          <w:tcPr>
+            <w:tcW w:type="dxa" w:w="1119"/>
+          </w:tcPr>
+          <w:p>
+            <w:r>
+              <w:t>225</w:t>
+            </w:r>
+          </w:p>
+        </w:tc>
+        <w:tc>
+          <w:tcPr>
+            <w:tcW w:type="dxa" w:w="1119"/>
+          </w:tcPr>
+          <w:p>
+            <w:r>
+              <w:t>3000615</w:t>
+            </w:r>
+          </w:p>
+        </w:tc>
+        <w:tc>
+          <w:tcPr>
+            <w:tcW w:type="dxa" w:w="1119"/>
+          </w:tcPr>
+          <w:p>
+            <w:r>
+              <w:t>62.38%</w:t>
+            </w:r>
+          </w:p>
+        </w:tc>
+        <w:tc>
+          <w:tcPr>
+            <w:tcW w:type="dxa" w:w="1118"/>
+          </w:tcPr>
+          <w:p>
+            <w:r>
+              <w:t>23.60%</w:t>
+            </w:r>
+          </w:p>
+        </w:tc>
+        <w:tc>
+          <w:tcPr>
+            <w:tcW w:type="dxa" w:w="1119"/>
+          </w:tcPr>
+          <w:p>
+            <w:r>
+              <w:t>9.86%</w:t>
+            </w:r>
+          </w:p>
+        </w:tc>
+        <w:tc>
+          <w:tcPr>
+            <w:tcW w:type="dxa" w:w="1120"/>
+          </w:tcPr>
+          <w:p>
+            <w:r>
+              <w:t>4.17%</w:t>
+            </w:r>
+          </w:p>
+        </w:tc>
+        <w:tc>
+          <w:tcPr>
+            <w:tcW w:type="dxa" w:w="1118"/>
+          </w:tcPr>
+          <w:p>
+            <w:r>
+              <w:t>37.92%</w:t>
+            </w:r>
+          </w:p>
+        </w:tc>
+        <w:tc>
+          <w:tcPr>
+            <w:tcW w:type="dxa" w:w="1118"/>
+          </w:tcPr>
+          <w:p>
+            <w:r>
+              <w:t>training-only; final eval non lanciata; route_short demotato a sorgente (raw=corr)</w:t>
+            </w:r>
+          </w:p>
+        </w:tc>
+      </w:tr>
     </w:tbl>
     <w:p>
       <w:pPr>
@@ -17823,6 +17955,24 @@
         <w:rPr>
           <w:lang w:val="it-IT"/>
         </w:rPr>
+      </w:r>
+    </w:p>
+    <w:p>
+      <w:pPr>
+        <w:pStyle w:val="Heading1"/>
+      </w:pPr>
+      <w:r>
+        <w:t>4.2 Conferma post-revert - carla_mappo_20260610_192146 (2026-06-12)</w:t>
+      </w:r>
+    </w:p>
+    <w:p>
+      <w:r>
+        <w:t>Prima run 3M completa sul trunk post-revert 23a0342 (config identica a step5: --difficulty path, seed 999, curriculum_lock off, distanze 30/60/100 m per veicoli e pedoni; codice funzionalmente identico a r0528). Integrita: 3297 episodi x 6 = 19782 record, zero NaN/inf; timesteps_total 3.000.615. Veicoli cumulativa: SR 62.38%, stuck+timeout 23.60%, collision 9.86%, offroad 4.17%, speed 13.12 km/h; per livello easy 67.25% / medium 62.48% / hard 54.39%. Pedoni (route_short demotato a sorgente da d84fa3a, quindi raw=corr): SR 37.92%, stuck+timeout 40.16%, speed 1.544 m/s; per livello 64.20% / 31.36% / 11.00%. Q1-&gt;Q4 veicoli: 66.10 / 68.20 / 60.48 / 54.73 (miglior tenuta late-training delle tre repliche 3M; quartili confusi dal mix di livelli - ultimi 50 episodi, tutti hard: veh SR 59.33%, ped SR 8.00%).</w:t>
+      </w:r>
+    </w:p>
+    <w:p>
+      <w:r>
+        <w:t>Bottom line: la regressione easy di r0529 (61.07%) NON si riproduce - easy torna nella banda delle repliche (step5 67.76%, r0528 67.18%): revert confermato sano. r0610 e' la migliore replica su medium/hard (hard 54.39% vs 33.18/34.47, collision hard 10.75% vs 21.89/19.92), ma senza cambi di codice va trattata come varianza run-to-run, non come guadagno di policy (range SR veicoli cumulativa n=3: 52.2-62.4%); velocita' veicoli la piu' bassa delle tre (13.12 vs 19.83/15.68 km/h), timeout hard 9.67% da monitorare. Collasso pedonale su medium/hard strutturale (route under_target 92.1%, too_short 47.4%, sidewalk_fallback 35.7%) - supporta la proposta Fix SR Pedoni (commit 226adb4, decisione pendente). Unlock in linea con le repliche: first medium ep 838 (25.4%), first hard ep 2392 (72.6%). Fonte: episodes.jsonl ricalcolato da disco con evaluate_run_static.py (min_route_ratio 0.5).</w:t>
       </w:r>
     </w:p>
     <w:p>

</xml_diff>